<commit_message>
Plan testiranja i izmene prethodnih dokumentacija
</commit_message>
<xml_diff>
--- a/Dokumentacija/D02_Vizija_Sistema.docx
+++ b/Dokumentacija/D02_Vizija_Sistema.docx
@@ -1,6 +1,6 @@
 
 <file path=word/document.xml><?xml version="1.0" encoding="utf-8"?>
-<w:document xmlns:wpc="http://schemas.microsoft.com/office/word/2010/wordprocessingCanvas" xmlns:mc="http://schemas.openxmlformats.org/markup-compatibility/2006" xmlns:o="urn:schemas-microsoft-com:office:office" xmlns:r="http://schemas.openxmlformats.org/officeDocument/2006/relationships" xmlns:m="http://schemas.openxmlformats.org/officeDocument/2006/math" xmlns:v="urn:schemas-microsoft-com:vml" xmlns:wp14="http://schemas.microsoft.com/office/word/2010/wordprocessingDrawing" xmlns:wp="http://schemas.openxmlformats.org/drawingml/2006/wordprocessingDrawing" xmlns:w10="urn:schemas-microsoft-com:office:word" xmlns:w="http://schemas.openxmlformats.org/wordprocessingml/2006/main" xmlns:w14="http://schemas.microsoft.com/office/word/2010/wordml" xmlns:wpg="http://schemas.microsoft.com/office/word/2010/wordprocessingGroup" xmlns:wpi="http://schemas.microsoft.com/office/word/2010/wordprocessingInk" xmlns:wne="http://schemas.microsoft.com/office/word/2006/wordml" xmlns:wps="http://schemas.microsoft.com/office/word/2010/wordprocessingShape" mc:Ignorable="w14 wp14">
+<w:document xmlns:wpc="http://schemas.microsoft.com/office/word/2010/wordprocessingCanvas" xmlns:cx="http://schemas.microsoft.com/office/drawing/2014/chartex" xmlns:cx1="http://schemas.microsoft.com/office/drawing/2015/9/8/chartex" xmlns:cx2="http://schemas.microsoft.com/office/drawing/2015/10/21/chartex" xmlns:cx3="http://schemas.microsoft.com/office/drawing/2016/5/9/chartex" xmlns:cx4="http://schemas.microsoft.com/office/drawing/2016/5/10/chartex" xmlns:cx5="http://schemas.microsoft.com/office/drawing/2016/5/11/chartex" xmlns:cx6="http://schemas.microsoft.com/office/drawing/2016/5/12/chartex" xmlns:cx7="http://schemas.microsoft.com/office/drawing/2016/5/13/chartex" xmlns:cx8="http://schemas.microsoft.com/office/drawing/2016/5/14/chartex" xmlns:mc="http://schemas.openxmlformats.org/markup-compatibility/2006" xmlns:aink="http://schemas.microsoft.com/office/drawing/2016/ink" xmlns:am3d="http://schemas.microsoft.com/office/drawing/2017/model3d" xmlns:o="urn:schemas-microsoft-com:office:office" xmlns:r="http://schemas.openxmlformats.org/officeDocument/2006/relationships" xmlns:m="http://schemas.openxmlformats.org/officeDocument/2006/math" xmlns:v="urn:schemas-microsoft-com:vml" xmlns:wp14="http://schemas.microsoft.com/office/word/2010/wordprocessingDrawing" xmlns:wp="http://schemas.openxmlformats.org/drawingml/2006/wordprocessingDrawing" xmlns:w10="urn:schemas-microsoft-com:office:word" xmlns:w="http://schemas.openxmlformats.org/wordprocessingml/2006/main" xmlns:w14="http://schemas.microsoft.com/office/word/2010/wordml" xmlns:w15="http://schemas.microsoft.com/office/word/2012/wordml" xmlns:w16cid="http://schemas.microsoft.com/office/word/2016/wordml/cid" xmlns:w16se="http://schemas.microsoft.com/office/word/2015/wordml/symex" xmlns:wpg="http://schemas.microsoft.com/office/word/2010/wordprocessingGroup" xmlns:wpi="http://schemas.microsoft.com/office/word/2010/wordprocessingInk" xmlns:wne="http://schemas.microsoft.com/office/word/2006/wordml" xmlns:wps="http://schemas.microsoft.com/office/word/2010/wordprocessingShape" mc:Ignorable="w14 w15 w16se w16cid wp14">
   <w:body>
     <w:p>
       <w:pPr>
@@ -107,8 +107,8 @@
           <w:lang w:val="sr-Latn-CS"/>
         </w:rPr>
         <w:sectPr>
-          <w:headerReference w:type="default" r:id="rId8"/>
-          <w:footerReference w:type="even" r:id="rId9"/>
+          <w:headerReference w:type="default" r:id="rId7"/>
+          <w:footerReference w:type="even" r:id="rId8"/>
           <w:pgSz w:w="12240" w:h="15840" w:code="1"/>
           <w:pgMar w:top="1440" w:right="1440" w:bottom="1440" w:left="1440" w:header="708" w:footer="708" w:gutter="0"/>
           <w:cols w:space="708"/>
@@ -289,6 +289,12 @@
               </w:rPr>
               <w:t>22</w:t>
             </w:r>
+            <w:r>
+              <w:rPr>
+                <w:lang w:val="sr-Latn-CS"/>
+              </w:rPr>
+              <w:t>.</w:t>
+            </w:r>
           </w:p>
         </w:tc>
         <w:tc>
@@ -361,6 +367,12 @@
                 <w:lang w:val="sr-Latn-CS"/>
               </w:rPr>
             </w:pPr>
+            <w:r>
+              <w:rPr>
+                <w:lang w:val="sr-Latn-CS"/>
+              </w:rPr>
+              <w:t>13.5.2022.</w:t>
+            </w:r>
           </w:p>
         </w:tc>
         <w:tc>
@@ -374,6 +386,12 @@
                 <w:lang w:val="sr-Latn-CS"/>
               </w:rPr>
             </w:pPr>
+            <w:r>
+              <w:rPr>
+                <w:lang w:val="sr-Latn-CS"/>
+              </w:rPr>
+              <w:t>2.0</w:t>
+            </w:r>
           </w:p>
         </w:tc>
         <w:tc>
@@ -387,6 +405,12 @@
                 <w:lang w:val="sr-Latn-CS"/>
               </w:rPr>
             </w:pPr>
+            <w:r>
+              <w:rPr>
+                <w:lang w:val="sr-Latn-CS"/>
+              </w:rPr>
+              <w:t>Izmenjena verzija</w:t>
+            </w:r>
           </w:p>
         </w:tc>
         <w:tc>
@@ -400,6 +424,14 @@
                 <w:lang w:val="sr-Latn-CS"/>
               </w:rPr>
             </w:pPr>
+            <w:r>
+              <w:rPr>
+                <w:lang w:val="sr-Latn-CS"/>
+              </w:rPr>
+              <w:t>Pavle Živanović, Nikola Jovanović, Andrija Ivković, Jovana Stojković</w:t>
+            </w:r>
+            <w:bookmarkStart w:id="0" w:name="_GoBack"/>
+            <w:bookmarkEnd w:id="0"/>
           </w:p>
         </w:tc>
       </w:tr>
@@ -3030,8 +3062,6 @@
         </w:rPr>
         <w:fldChar w:fldCharType="end"/>
       </w:r>
-      <w:bookmarkStart w:id="0" w:name="_GoBack"/>
-      <w:bookmarkEnd w:id="0"/>
       <w:r>
         <w:rPr>
           <w:lang w:val="sr-Latn-CS"/>
@@ -3395,7 +3425,19 @@
         <w:rPr>
           <w:lang w:val="sr-Latn-CS"/>
         </w:rPr>
-        <w:t>orisnik može da napravi tim u kome će biti vodja ili se može unosom koda priključiti nekom timu gde će imati ulogu običnog člana. Takodje vodja tima može dodavati članove tima(alternativa je priključivanje preko koda).</w:t>
+        <w:t>orisnik može da napravi tim</w:t>
+      </w:r>
+      <w:r>
+        <w:rPr>
+          <w:lang w:val="sr-Latn-CS"/>
+        </w:rPr>
+        <w:t xml:space="preserve"> i organizaciju</w:t>
+      </w:r>
+      <w:r>
+        <w:rPr>
+          <w:lang w:val="sr-Latn-CS"/>
+        </w:rPr>
+        <w:t xml:space="preserve"> u kome će biti vodja ili se može unosom koda priključiti nekom timu gde će imati ulogu običnog člana. Takodje vodja tima može dodavati članove tima(alternativa je priključivanje preko koda).</w:t>
       </w:r>
     </w:p>
     <w:p>
@@ -4143,6 +4185,7 @@
             </w:r>
             <w:proofErr w:type="spellStart"/>
             <w:r>
+              <w:lastRenderedPageBreak/>
               <w:t>raspodelu</w:t>
             </w:r>
             <w:proofErr w:type="spellEnd"/>
@@ -4387,15 +4430,7 @@
             </w:r>
             <w:proofErr w:type="spellEnd"/>
             <w:r>
-              <w:t xml:space="preserve"> </w:t>
-            </w:r>
-            <w:proofErr w:type="spellStart"/>
-            <w:r>
-              <w:t>deo</w:t>
-            </w:r>
-            <w:proofErr w:type="spellEnd"/>
-            <w:r>
-              <w:t xml:space="preserve"> </w:t>
+              <w:t xml:space="preserve"> deo </w:t>
             </w:r>
             <w:proofErr w:type="spellStart"/>
             <w:r>
@@ -4681,15 +4716,7 @@
             </w:r>
             <w:proofErr w:type="spellEnd"/>
             <w:r>
-              <w:t xml:space="preserve"> </w:t>
-            </w:r>
-            <w:proofErr w:type="spellStart"/>
-            <w:r>
-              <w:t>za</w:t>
-            </w:r>
-            <w:proofErr w:type="spellEnd"/>
-            <w:r>
-              <w:t xml:space="preserve"> </w:t>
+              <w:t xml:space="preserve"> za </w:t>
             </w:r>
             <w:proofErr w:type="spellStart"/>
             <w:r>
@@ -5028,14 +5055,293 @@
       <w:pPr>
         <w:pStyle w:val="BodyText"/>
         <w:rPr>
-          <w:lang w:val="sr-Latn-CS"/>
-        </w:rPr>
-      </w:pPr>
-      <w:r>
-        <w:rPr>
-          <w:lang w:val="sr-Latn-CS"/>
-        </w:rPr>
-        <w:t xml:space="preserve">Administrator je zadužen za instaliranje, konfigurisanje i kasnije održavanje konfiguracije </w:t>
+          <w:rFonts w:asciiTheme="minorBidi" w:hAnsiTheme="minorBidi" w:cstheme="minorBidi"/>
+          <w:lang w:val="sr-Latn-CS"/>
+        </w:rPr>
+      </w:pPr>
+      <w:r>
+        <w:rPr>
+          <w:rFonts w:asciiTheme="minorBidi" w:hAnsiTheme="minorBidi" w:cstheme="minorBidi"/>
+          <w:lang w:val="sr-Latn-CS"/>
+        </w:rPr>
+        <w:t>Administrator j</w:t>
+      </w:r>
+      <w:r>
+        <w:rPr>
+          <w:rFonts w:asciiTheme="minorBidi" w:hAnsiTheme="minorBidi" w:cstheme="minorBidi"/>
+          <w:lang w:val="sr-Latn-CS"/>
+        </w:rPr>
+        <w:t>e zaduzen za kreiranje i upravljanje organizacijama.Moze da dodaje i izbacuje nove clanove u svoju organizaciju i da kreira timove u okviru organizacije.</w:t>
+      </w:r>
+    </w:p>
+    <w:p>
+      <w:pPr>
+        <w:pStyle w:val="BodyText"/>
+        <w:rPr>
+          <w:lang w:val="sr-Latn-CS"/>
+        </w:rPr>
+      </w:pPr>
+      <w:r>
+        <w:rPr>
+          <w:lang w:val="sr-Latn-CS"/>
+        </w:rPr>
+        <w:t>U ulozi administratora će se najčešće naći fakultetski obrazovana osoba sa visokim nivoom poznavanja rada na računaru i administriranja Web servera</w:t>
+      </w:r>
+      <w:r>
+        <w:rPr>
+          <w:lang w:val="sr-Latn-CS"/>
+        </w:rPr>
+        <w:t>.</w:t>
+      </w:r>
+      <w:r>
+        <w:rPr>
+          <w:lang w:val="sr-Latn-CS"/>
+        </w:rPr>
+        <w:t xml:space="preserve"> </w:t>
+      </w:r>
+    </w:p>
+    <w:p>
+      <w:pPr>
+        <w:pStyle w:val="BodyText"/>
+        <w:ind w:left="0" w:firstLine="720"/>
+        <w:rPr>
+          <w:b/>
+          <w:lang w:val="sr-Latn-CS"/>
+        </w:rPr>
+      </w:pPr>
+      <w:r>
+        <w:rPr>
+          <w:b/>
+          <w:lang w:val="sr-Latn-CS"/>
+        </w:rPr>
+        <w:t xml:space="preserve">Vođa </w:t>
+      </w:r>
+      <w:r>
+        <w:rPr>
+          <w:b/>
+          <w:lang w:val="sr-Latn-CS"/>
+        </w:rPr>
+        <w:t>tima</w:t>
+      </w:r>
+      <w:r>
+        <w:rPr>
+          <w:b/>
+          <w:lang w:val="sr-Latn-CS"/>
+        </w:rPr>
+        <w:t>:</w:t>
+      </w:r>
+    </w:p>
+    <w:p>
+      <w:pPr>
+        <w:pStyle w:val="BodyText"/>
+        <w:rPr>
+          <w:lang w:val="sr-Latn-CS"/>
+        </w:rPr>
+      </w:pPr>
+      <w:r>
+        <w:rPr>
+          <w:lang w:val="sr-Latn-CS"/>
+        </w:rPr>
+        <w:t xml:space="preserve">Vođa tima </w:t>
+      </w:r>
+      <w:r>
+        <w:rPr>
+          <w:lang w:val="sr-Latn-CS"/>
+        </w:rPr>
+        <w:t>je zadužen za podelu projekta na zadatke od kojih svaki zadatak nosi odredjeni  procenat (važnost) i ima rok izrade.</w:t>
+      </w:r>
+    </w:p>
+    <w:p>
+      <w:pPr>
+        <w:pStyle w:val="BodyText"/>
+        <w:rPr>
+          <w:lang w:val="sr-Latn-CS"/>
+        </w:rPr>
+      </w:pPr>
+      <w:r>
+        <w:rPr>
+          <w:lang w:val="sr-Latn-CS"/>
+        </w:rPr>
+        <w:t>Vođa tima na osnovu njihovog profila(angažovanje na prethodnim projektima) bira osobu koja će raditi taj zadatak.</w:t>
+      </w:r>
+    </w:p>
+    <w:p>
+      <w:pPr>
+        <w:pStyle w:val="BodyText"/>
+        <w:rPr>
+          <w:b/>
+          <w:lang w:val="sr-Latn-CS"/>
+        </w:rPr>
+      </w:pPr>
+      <w:r>
+        <w:rPr>
+          <w:b/>
+          <w:lang w:val="sr-Latn-CS"/>
+        </w:rPr>
+        <w:t xml:space="preserve">Član </w:t>
+      </w:r>
+      <w:r>
+        <w:rPr>
+          <w:b/>
+          <w:lang w:val="sr-Latn-CS"/>
+        </w:rPr>
+        <w:t>tima</w:t>
+      </w:r>
+      <w:r>
+        <w:rPr>
+          <w:b/>
+          <w:lang w:val="sr-Latn-CS"/>
+        </w:rPr>
+        <w:t xml:space="preserve"> (skraćeno član)</w:t>
+      </w:r>
+      <w:r>
+        <w:rPr>
+          <w:b/>
+          <w:lang w:val="sr-Latn-CS"/>
+        </w:rPr>
+        <w:t>:</w:t>
+      </w:r>
+    </w:p>
+    <w:p>
+      <w:pPr>
+        <w:pStyle w:val="BodyText"/>
+        <w:rPr>
+          <w:lang w:val="sr-Latn-CS"/>
+        </w:rPr>
+      </w:pPr>
+      <w:r>
+        <w:rPr>
+          <w:lang w:val="sr-Latn-CS"/>
+        </w:rPr>
+        <w:t xml:space="preserve">Član grupe </w:t>
+      </w:r>
+      <w:r>
+        <w:rPr>
+          <w:lang w:val="sr-Latn-CS"/>
+        </w:rPr>
+        <w:t xml:space="preserve">je bilo koji korisnik koji se učlani u neku grupu. Ne postoji ograničenje u broju grupa u kojima on može biti. </w:t>
+      </w:r>
+    </w:p>
+    <w:p>
+      <w:pPr>
+        <w:pStyle w:val="BodyText"/>
+        <w:rPr>
+          <w:lang w:val="sr-Latn-CS"/>
+        </w:rPr>
+      </w:pPr>
+      <w:r>
+        <w:rPr>
+          <w:lang w:val="sr-Latn-CS"/>
+        </w:rPr>
+        <w:t xml:space="preserve">Član </w:t>
+      </w:r>
+      <w:r>
+        <w:rPr>
+          <w:lang w:val="sr-Latn-CS"/>
+        </w:rPr>
+        <w:t>tima može da pošalje zahtev za pristup timu ili da se pridruži timu pomoću koda.</w:t>
+      </w:r>
+    </w:p>
+    <w:p>
+      <w:pPr>
+        <w:pStyle w:val="BodyText"/>
+        <w:rPr>
+          <w:lang w:val="sr-Latn-CS"/>
+        </w:rPr>
+      </w:pPr>
+      <w:r>
+        <w:rPr>
+          <w:lang w:val="sr-Latn-CS"/>
+        </w:rPr>
+        <w:t>Na profilu članova tima vrši se evidencija o učešću na projektima.</w:t>
+      </w:r>
+    </w:p>
+    <w:p>
+      <w:pPr>
+        <w:pStyle w:val="BodyText"/>
+        <w:rPr>
+          <w:rFonts w:asciiTheme="minorBidi" w:hAnsiTheme="minorBidi" w:cstheme="minorBidi"/>
+          <w:b/>
+          <w:bCs/>
+          <w:lang w:val="sr-Latn-CS"/>
+        </w:rPr>
+      </w:pPr>
+      <w:r>
+        <w:rPr>
+          <w:rFonts w:asciiTheme="minorBidi" w:hAnsiTheme="minorBidi" w:cstheme="minorBidi"/>
+          <w:b/>
+          <w:bCs/>
+          <w:lang w:val="sr-Latn-CS"/>
+        </w:rPr>
+        <w:t>Clan organizacije :</w:t>
+      </w:r>
+    </w:p>
+    <w:p>
+      <w:pPr>
+        <w:pStyle w:val="BodyText"/>
+        <w:rPr>
+          <w:rFonts w:asciiTheme="minorBidi" w:hAnsiTheme="minorBidi" w:cstheme="minorBidi"/>
+          <w:lang w:val="sr-Latn-CS"/>
+        </w:rPr>
+      </w:pPr>
+      <w:r>
+        <w:rPr>
+          <w:rFonts w:asciiTheme="minorBidi" w:hAnsiTheme="minorBidi" w:cstheme="minorBidi"/>
+          <w:lang w:val="sr-Latn-CS"/>
+        </w:rPr>
+        <w:t>Clan organizacije moze da kreira timove u okviru organizacije i time postaje vodja tima u okviru te organizacije</w:t>
+      </w:r>
+      <w:r>
+        <w:rPr>
+          <w:rFonts w:asciiTheme="minorBidi" w:hAnsiTheme="minorBidi" w:cstheme="minorBidi"/>
+          <w:lang w:val="sr-Latn-CS"/>
+        </w:rPr>
+        <w:t>.Takodje clanu organizacije je omogucen prikaz timova u okviru organizacije.</w:t>
+      </w:r>
+    </w:p>
+    <w:p>
+      <w:pPr>
+        <w:pStyle w:val="BodyText"/>
+        <w:rPr>
+          <w:lang w:val="sr-Latn-CS"/>
+        </w:rPr>
+      </w:pPr>
+    </w:p>
+    <w:p>
+      <w:pPr>
+        <w:pStyle w:val="Heading2"/>
+        <w:rPr>
+          <w:lang w:val="sr-Latn-CS"/>
+        </w:rPr>
+      </w:pPr>
+      <w:bookmarkStart w:id="11" w:name="_Toc161771501"/>
+      <w:r>
+        <w:rPr>
+          <w:lang w:val="sr-Latn-CS"/>
+        </w:rPr>
+        <w:t>Opis okruženja</w:t>
+      </w:r>
+      <w:bookmarkEnd w:id="11"/>
+    </w:p>
+    <w:p>
+      <w:pPr>
+        <w:rPr>
+          <w:lang w:val="sr-Latn-CS"/>
+        </w:rPr>
+      </w:pPr>
+    </w:p>
+    <w:p>
+      <w:pPr>
+        <w:pStyle w:val="BodyText"/>
+        <w:rPr>
+          <w:lang w:val="sr-Latn-CS"/>
+        </w:rPr>
+      </w:pPr>
+      <w:r>
+        <w:rPr>
+          <w:lang w:val="sr-Latn-CS"/>
+        </w:rPr>
+        <w:t xml:space="preserve">Korisnici </w:t>
       </w:r>
       <w:r>
         <w:rPr>
@@ -5047,208 +5353,19 @@
         <w:rPr>
           <w:lang w:val="sr-Latn-CS"/>
         </w:rPr>
-        <w:t xml:space="preserve">. </w:t>
-      </w:r>
-    </w:p>
-    <w:p>
-      <w:pPr>
-        <w:pStyle w:val="BodyText"/>
-        <w:rPr>
-          <w:lang w:val="sr-Latn-CS"/>
-        </w:rPr>
-      </w:pPr>
-      <w:r>
-        <w:rPr>
-          <w:lang w:val="sr-Latn-CS"/>
-        </w:rPr>
-        <w:t>U ulozi administratora će se najčešće naći fakultetski obrazovana osoba sa visokim nivoom poznavanja rada na računaru i administriranja Web servera</w:t>
-      </w:r>
-      <w:r>
-        <w:rPr>
-          <w:lang w:val="sr-Latn-CS"/>
-        </w:rPr>
-        <w:t>.</w:t>
-      </w:r>
-      <w:r>
-        <w:rPr>
-          <w:lang w:val="sr-Latn-CS"/>
-        </w:rPr>
-        <w:t xml:space="preserve"> </w:t>
-      </w:r>
-    </w:p>
-    <w:p>
-      <w:pPr>
-        <w:pStyle w:val="BodyText"/>
-        <w:rPr>
-          <w:lang w:val="sr-Latn-CS"/>
-        </w:rPr>
-      </w:pPr>
-      <w:r>
-        <w:rPr>
-          <w:lang w:val="sr-Latn-CS"/>
-        </w:rPr>
-        <w:t xml:space="preserve">Administrator će imati pristup svim funkcijama </w:t>
-      </w:r>
-      <w:r>
-        <w:rPr>
-          <w:lang w:val="sr-Latn-CS"/>
-        </w:rPr>
-        <w:t>sistema.</w:t>
-      </w:r>
-    </w:p>
-    <w:p>
-      <w:pPr>
-        <w:pStyle w:val="BodyText"/>
-        <w:rPr>
-          <w:b/>
-          <w:lang w:val="sr-Latn-CS"/>
-        </w:rPr>
-      </w:pPr>
-      <w:r>
-        <w:rPr>
-          <w:b/>
-          <w:lang w:val="sr-Latn-CS"/>
-        </w:rPr>
-        <w:t xml:space="preserve">Vođa </w:t>
-      </w:r>
-      <w:r>
-        <w:rPr>
-          <w:b/>
-          <w:lang w:val="sr-Latn-CS"/>
-        </w:rPr>
-        <w:t>tima</w:t>
-      </w:r>
-      <w:r>
-        <w:rPr>
-          <w:b/>
-          <w:lang w:val="sr-Latn-CS"/>
-        </w:rPr>
-        <w:t>:</w:t>
-      </w:r>
-    </w:p>
-    <w:p>
-      <w:pPr>
-        <w:pStyle w:val="BodyText"/>
-        <w:rPr>
-          <w:lang w:val="sr-Latn-CS"/>
-        </w:rPr>
-      </w:pPr>
-      <w:r>
-        <w:rPr>
-          <w:lang w:val="sr-Latn-CS"/>
-        </w:rPr>
-        <w:t xml:space="preserve">Vođa tima </w:t>
-      </w:r>
-      <w:r>
-        <w:rPr>
-          <w:lang w:val="sr-Latn-CS"/>
-        </w:rPr>
-        <w:t>je zadužen za podelu projekta na zadatke od kojih svaki zadatak nosi odredjeni  procenat (važnost) i ima rok izrade.</w:t>
-      </w:r>
-    </w:p>
-    <w:p>
-      <w:pPr>
-        <w:pStyle w:val="BodyText"/>
-        <w:rPr>
-          <w:lang w:val="sr-Latn-CS"/>
-        </w:rPr>
-      </w:pPr>
-      <w:r>
-        <w:rPr>
-          <w:lang w:val="sr-Latn-CS"/>
-        </w:rPr>
-        <w:t>Vođa tima na osnovu njihovog profila(angažovanje na prethodnim projektima) bira osobu koja će raditi taj zadatak.</w:t>
-      </w:r>
-    </w:p>
-    <w:p>
-      <w:pPr>
-        <w:pStyle w:val="BodyText"/>
-        <w:rPr>
-          <w:b/>
-          <w:lang w:val="sr-Latn-CS"/>
-        </w:rPr>
-      </w:pPr>
-      <w:r>
-        <w:rPr>
-          <w:b/>
-          <w:lang w:val="sr-Latn-CS"/>
-        </w:rPr>
-        <w:t xml:space="preserve">Član </w:t>
-      </w:r>
-      <w:r>
-        <w:rPr>
-          <w:b/>
-          <w:lang w:val="sr-Latn-CS"/>
-        </w:rPr>
-        <w:t>tima</w:t>
-      </w:r>
-      <w:r>
-        <w:rPr>
-          <w:b/>
-          <w:lang w:val="sr-Latn-CS"/>
-        </w:rPr>
-        <w:t xml:space="preserve"> (skraćeno član)</w:t>
-      </w:r>
-      <w:r>
-        <w:rPr>
-          <w:b/>
-          <w:lang w:val="sr-Latn-CS"/>
-        </w:rPr>
-        <w:t>:</w:t>
-      </w:r>
-    </w:p>
-    <w:p>
-      <w:pPr>
-        <w:pStyle w:val="BodyText"/>
-        <w:rPr>
-          <w:lang w:val="sr-Latn-CS"/>
-        </w:rPr>
-      </w:pPr>
-      <w:r>
-        <w:rPr>
-          <w:lang w:val="sr-Latn-CS"/>
-        </w:rPr>
-        <w:t xml:space="preserve">Član grupe </w:t>
-      </w:r>
-      <w:r>
-        <w:rPr>
-          <w:lang w:val="sr-Latn-CS"/>
-        </w:rPr>
-        <w:t xml:space="preserve">je bilo koji korisnik koji se učlani u neku grupu. Ne postoji ograničenje u broju grupa u kojima on može biti. </w:t>
-      </w:r>
-    </w:p>
-    <w:p>
-      <w:pPr>
-        <w:pStyle w:val="BodyText"/>
-        <w:rPr>
-          <w:lang w:val="sr-Latn-CS"/>
-        </w:rPr>
-      </w:pPr>
-      <w:r>
-        <w:rPr>
-          <w:lang w:val="sr-Latn-CS"/>
-        </w:rPr>
-        <w:t xml:space="preserve">Član </w:t>
-      </w:r>
-      <w:r>
-        <w:rPr>
-          <w:lang w:val="sr-Latn-CS"/>
-        </w:rPr>
-        <w:t>tima može da pošalje zahtev za pristup timu ili da se pridruži timu pomoću koda.</w:t>
-      </w:r>
-    </w:p>
-    <w:p>
-      <w:pPr>
-        <w:pStyle w:val="BodyText"/>
-        <w:rPr>
-          <w:lang w:val="sr-Latn-CS"/>
-        </w:rPr>
-      </w:pPr>
-      <w:r>
-        <w:rPr>
-          <w:lang w:val="sr-Latn-CS"/>
-        </w:rPr>
-        <w:t>Na profilu članova tima vrši se evidencija o učešću na projektima.</w:t>
+        <w:t xml:space="preserve"> pristupaju sistemu preko Web-a </w:t>
+      </w:r>
+      <w:r>
+        <w:rPr>
+          <w:lang w:val="sr-Latn-CS"/>
+        </w:rPr>
+        <w:t>preko Interneta. Ne p</w:t>
+      </w:r>
+      <w:r>
+        <w:rPr>
+          <w:lang w:val="sr-Latn-CS"/>
+        </w:rPr>
+        <w:t>ostoje posebna ograničenja u pogledu okruženja.</w:t>
       </w:r>
     </w:p>
     <w:p>
@@ -5258,73 +5375,11 @@
           <w:lang w:val="sr-Latn-CS"/>
         </w:rPr>
       </w:pPr>
-      <w:bookmarkStart w:id="11" w:name="_Toc161771501"/>
-      <w:r>
-        <w:rPr>
-          <w:lang w:val="sr-Latn-CS"/>
-        </w:rPr>
-        <w:t>Opis okruženja</w:t>
-      </w:r>
-      <w:bookmarkEnd w:id="11"/>
-    </w:p>
-    <w:p>
-      <w:pPr>
-        <w:rPr>
-          <w:lang w:val="sr-Latn-CS"/>
-        </w:rPr>
-      </w:pPr>
-    </w:p>
-    <w:p>
-      <w:pPr>
-        <w:pStyle w:val="BodyText"/>
-        <w:rPr>
-          <w:lang w:val="sr-Latn-CS"/>
-        </w:rPr>
-      </w:pPr>
-      <w:r>
-        <w:rPr>
-          <w:lang w:val="sr-Latn-CS"/>
-        </w:rPr>
-        <w:t xml:space="preserve">Korisnici </w:t>
-      </w:r>
-      <w:r>
-        <w:rPr>
-          <w:lang w:val="sr-Latn-CS"/>
-        </w:rPr>
-        <w:t>aplikacije</w:t>
-      </w:r>
-      <w:r>
-        <w:rPr>
-          <w:lang w:val="sr-Latn-CS"/>
-        </w:rPr>
-        <w:t xml:space="preserve"> pristupaju sistemu preko Web-a </w:t>
-      </w:r>
-      <w:r>
-        <w:rPr>
-          <w:lang w:val="sr-Latn-CS"/>
-        </w:rPr>
-        <w:t>preko Interneta. Ne p</w:t>
-      </w:r>
-      <w:r>
-        <w:rPr>
-          <w:lang w:val="sr-Latn-CS"/>
-        </w:rPr>
-        <w:t>ostoje posebna ograničenja u pogledu okruženja.</w:t>
-      </w:r>
-    </w:p>
-    <w:p>
-      <w:pPr>
-        <w:pStyle w:val="Heading2"/>
-        <w:rPr>
-          <w:lang w:val="sr-Latn-CS"/>
-        </w:rPr>
-      </w:pPr>
       <w:bookmarkStart w:id="12" w:name="_Toc161771502"/>
       <w:r>
         <w:rPr>
           <w:lang w:val="sr-Latn-CS"/>
         </w:rPr>
-        <w:lastRenderedPageBreak/>
         <w:t>Osnovne potrebe korisnika</w:t>
       </w:r>
       <w:bookmarkEnd w:id="12"/>
@@ -5659,15 +5714,7 @@
       </w:r>
       <w:proofErr w:type="spellEnd"/>
       <w:r>
-        <w:t xml:space="preserve"> </w:t>
-      </w:r>
-      <w:proofErr w:type="spellStart"/>
-      <w:r>
-        <w:t>za</w:t>
-      </w:r>
-      <w:proofErr w:type="spellEnd"/>
-      <w:r>
-        <w:t xml:space="preserve"> </w:t>
+        <w:t xml:space="preserve"> za </w:t>
       </w:r>
       <w:proofErr w:type="spellStart"/>
       <w:r>
@@ -5835,45 +5882,123 @@
       </w:r>
       <w:proofErr w:type="spellEnd"/>
       <w:r>
+        <w:t xml:space="preserve"> deo </w:t>
+      </w:r>
+      <w:proofErr w:type="spellStart"/>
+      <w:r>
+        <w:t>će</w:t>
+      </w:r>
+      <w:proofErr w:type="spellEnd"/>
+      <w:r>
+        <w:t xml:space="preserve"> se </w:t>
+      </w:r>
+      <w:proofErr w:type="spellStart"/>
+      <w:r>
+        <w:t>izvršavati</w:t>
+      </w:r>
+      <w:proofErr w:type="spellEnd"/>
+      <w:r>
+        <w:t xml:space="preserve"> u </w:t>
+      </w:r>
+      <w:proofErr w:type="spellStart"/>
+      <w:r>
+        <w:t>kontekstu</w:t>
+      </w:r>
+      <w:proofErr w:type="spellEnd"/>
+      <w:r>
+        <w:t xml:space="preserve"> Web </w:t>
+      </w:r>
+      <w:proofErr w:type="spellStart"/>
+      <w:r>
+        <w:t>servera</w:t>
+      </w:r>
+      <w:proofErr w:type="spellEnd"/>
+      <w:r>
         <w:t xml:space="preserve"> </w:t>
       </w:r>
       <w:proofErr w:type="spellStart"/>
       <w:r>
-        <w:t>deo</w:t>
+        <w:t>na</w:t>
       </w:r>
       <w:proofErr w:type="spellEnd"/>
       <w:r>
         <w:t xml:space="preserve"> </w:t>
       </w:r>
       <w:proofErr w:type="spellStart"/>
-      <w:proofErr w:type="gramStart"/>
+      <w:r>
+        <w:t>personalnom</w:t>
+      </w:r>
+      <w:proofErr w:type="spellEnd"/>
+      <w:r>
+        <w:t xml:space="preserve"> </w:t>
+      </w:r>
+      <w:proofErr w:type="spellStart"/>
+      <w:r>
+        <w:t>računaru</w:t>
+      </w:r>
+      <w:proofErr w:type="spellEnd"/>
+      <w:r>
+        <w:t xml:space="preserve"> </w:t>
+      </w:r>
+      <w:proofErr w:type="spellStart"/>
+      <w:r>
+        <w:t>koji</w:t>
+      </w:r>
+      <w:proofErr w:type="spellEnd"/>
+      <w:r>
+        <w:t xml:space="preserve"> je za to </w:t>
+      </w:r>
+      <w:proofErr w:type="spellStart"/>
+      <w:r>
+        <w:t>namenjen</w:t>
+      </w:r>
+      <w:proofErr w:type="spellEnd"/>
+      <w:r>
+        <w:t xml:space="preserve"> (</w:t>
+      </w:r>
+      <w:proofErr w:type="spellStart"/>
+      <w:r>
+        <w:t>Slika</w:t>
+      </w:r>
+      <w:proofErr w:type="spellEnd"/>
+      <w:r>
+        <w:t xml:space="preserve"> 6.1.2). </w:t>
+      </w:r>
+      <w:proofErr w:type="spellStart"/>
+      <w:r>
+        <w:t>Klijentski</w:t>
+      </w:r>
+      <w:proofErr w:type="spellEnd"/>
+      <w:r>
+        <w:t xml:space="preserve"> deo </w:t>
+      </w:r>
+      <w:proofErr w:type="spellStart"/>
       <w:r>
         <w:t>će</w:t>
       </w:r>
       <w:proofErr w:type="spellEnd"/>
-      <w:proofErr w:type="gramEnd"/>
-      <w:r>
-        <w:t xml:space="preserve"> se </w:t>
+      <w:r>
+        <w:t xml:space="preserve"> </w:t>
       </w:r>
       <w:proofErr w:type="spellStart"/>
       <w:r>
-        <w:t>izvršavati</w:t>
+        <w:t>predstavljati</w:t>
       </w:r>
       <w:proofErr w:type="spellEnd"/>
       <w:r>
-        <w:t xml:space="preserve"> u </w:t>
+        <w:t xml:space="preserve"> WEB </w:t>
       </w:r>
       <w:proofErr w:type="spellStart"/>
       <w:r>
-        <w:t>kontekstu</w:t>
+        <w:t>aplikacija</w:t>
       </w:r>
       <w:proofErr w:type="spellEnd"/>
       <w:r>
-        <w:t xml:space="preserve"> Web </w:t>
+        <w:t xml:space="preserve">. </w:t>
       </w:r>
       <w:proofErr w:type="spellStart"/>
       <w:r>
-        <w:t>servera</w:t>
+        <w:t>Pri</w:t>
       </w:r>
       <w:proofErr w:type="spellEnd"/>
       <w:r>
@@ -5881,181 +6006,73 @@
       </w:r>
       <w:proofErr w:type="spellStart"/>
       <w:r>
+        <w:t>izboru</w:t>
+      </w:r>
+      <w:proofErr w:type="spellEnd"/>
+      <w:r>
+        <w:t xml:space="preserve"> </w:t>
+      </w:r>
+      <w:proofErr w:type="spellStart"/>
+      <w:r>
+        <w:t>tehnologije</w:t>
+      </w:r>
+      <w:proofErr w:type="spellEnd"/>
+      <w:r>
+        <w:t xml:space="preserve"> </w:t>
+      </w:r>
+      <w:proofErr w:type="spellStart"/>
+      <w:r>
+        <w:t>potrebno</w:t>
+      </w:r>
+      <w:proofErr w:type="spellEnd"/>
+      <w:r>
+        <w:t xml:space="preserve"> je </w:t>
+      </w:r>
+      <w:proofErr w:type="spellStart"/>
+      <w:r>
+        <w:t>voditi</w:t>
+      </w:r>
+      <w:proofErr w:type="spellEnd"/>
+      <w:r>
+        <w:t xml:space="preserve"> </w:t>
+      </w:r>
+      <w:proofErr w:type="spellStart"/>
+      <w:r>
+        <w:t>računa</w:t>
+      </w:r>
+      <w:proofErr w:type="spellEnd"/>
+      <w:r>
+        <w:t xml:space="preserve"> da </w:t>
+      </w:r>
+      <w:proofErr w:type="spellStart"/>
+      <w:r>
+        <w:t>sistem</w:t>
+      </w:r>
+      <w:proofErr w:type="spellEnd"/>
+      <w:r>
+        <w:t xml:space="preserve"> </w:t>
+      </w:r>
+      <w:proofErr w:type="spellStart"/>
+      <w:r>
+        <w:t>može</w:t>
+      </w:r>
+      <w:proofErr w:type="spellEnd"/>
+      <w:r>
+        <w:t xml:space="preserve"> </w:t>
+      </w:r>
+      <w:proofErr w:type="spellStart"/>
+      <w:r>
+        <w:t>raditi</w:t>
+      </w:r>
+      <w:proofErr w:type="spellEnd"/>
+      <w:r>
+        <w:t xml:space="preserve"> </w:t>
+      </w:r>
+      <w:proofErr w:type="spellStart"/>
+      <w:r>
         <w:t>na</w:t>
       </w:r>
       <w:proofErr w:type="spellEnd"/>
-      <w:r>
-        <w:t xml:space="preserve"> </w:t>
-      </w:r>
-      <w:proofErr w:type="spellStart"/>
-      <w:r>
-        <w:t>personalnom</w:t>
-      </w:r>
-      <w:proofErr w:type="spellEnd"/>
-      <w:r>
-        <w:t xml:space="preserve"> </w:t>
-      </w:r>
-      <w:proofErr w:type="spellStart"/>
-      <w:r>
-        <w:t>računaru</w:t>
-      </w:r>
-      <w:proofErr w:type="spellEnd"/>
-      <w:r>
-        <w:t xml:space="preserve"> </w:t>
-      </w:r>
-      <w:proofErr w:type="spellStart"/>
-      <w:r>
-        <w:t>koji</w:t>
-      </w:r>
-      <w:proofErr w:type="spellEnd"/>
-      <w:r>
-        <w:t xml:space="preserve"> je </w:t>
-      </w:r>
-      <w:proofErr w:type="spellStart"/>
-      <w:r>
-        <w:t>za</w:t>
-      </w:r>
-      <w:proofErr w:type="spellEnd"/>
-      <w:r>
-        <w:t xml:space="preserve"> to </w:t>
-      </w:r>
-      <w:proofErr w:type="spellStart"/>
-      <w:r>
-        <w:t>namenjen</w:t>
-      </w:r>
-      <w:proofErr w:type="spellEnd"/>
-      <w:r>
-        <w:t xml:space="preserve"> (</w:t>
-      </w:r>
-      <w:proofErr w:type="spellStart"/>
-      <w:r>
-        <w:t>Slika</w:t>
-      </w:r>
-      <w:proofErr w:type="spellEnd"/>
-      <w:r>
-        <w:t xml:space="preserve"> 6.1.2). </w:t>
-      </w:r>
-      <w:proofErr w:type="spellStart"/>
-      <w:r>
-        <w:t>Klijentski</w:t>
-      </w:r>
-      <w:proofErr w:type="spellEnd"/>
-      <w:r>
-        <w:t xml:space="preserve"> </w:t>
-      </w:r>
-      <w:proofErr w:type="spellStart"/>
-      <w:r>
-        <w:t>deo</w:t>
-      </w:r>
-      <w:proofErr w:type="spellEnd"/>
-      <w:r>
-        <w:t xml:space="preserve"> </w:t>
-      </w:r>
-      <w:proofErr w:type="spellStart"/>
-      <w:proofErr w:type="gramStart"/>
-      <w:r>
-        <w:t>će</w:t>
-      </w:r>
-      <w:proofErr w:type="spellEnd"/>
-      <w:proofErr w:type="gramEnd"/>
-      <w:r>
-        <w:t xml:space="preserve"> </w:t>
-      </w:r>
-      <w:proofErr w:type="spellStart"/>
-      <w:r>
-        <w:t>predstavljati</w:t>
-      </w:r>
-      <w:proofErr w:type="spellEnd"/>
-      <w:r>
-        <w:t xml:space="preserve"> WEB </w:t>
-      </w:r>
-      <w:proofErr w:type="spellStart"/>
-      <w:r>
-        <w:t>aplikacija</w:t>
-      </w:r>
-      <w:proofErr w:type="spellEnd"/>
-      <w:r>
-        <w:t xml:space="preserve">. </w:t>
-      </w:r>
-      <w:proofErr w:type="spellStart"/>
-      <w:r>
-        <w:t>Pri</w:t>
-      </w:r>
-      <w:proofErr w:type="spellEnd"/>
-      <w:r>
-        <w:t xml:space="preserve"> </w:t>
-      </w:r>
-      <w:proofErr w:type="spellStart"/>
-      <w:r>
-        <w:t>izboru</w:t>
-      </w:r>
-      <w:proofErr w:type="spellEnd"/>
-      <w:r>
-        <w:t xml:space="preserve"> </w:t>
-      </w:r>
-      <w:proofErr w:type="spellStart"/>
-      <w:r>
-        <w:t>tehnologije</w:t>
-      </w:r>
-      <w:proofErr w:type="spellEnd"/>
-      <w:r>
-        <w:t xml:space="preserve"> </w:t>
-      </w:r>
-      <w:proofErr w:type="spellStart"/>
-      <w:r>
-        <w:t>potrebno</w:t>
-      </w:r>
-      <w:proofErr w:type="spellEnd"/>
-      <w:r>
-        <w:t xml:space="preserve"> je </w:t>
-      </w:r>
-      <w:proofErr w:type="spellStart"/>
-      <w:r>
-        <w:t>voditi</w:t>
-      </w:r>
-      <w:proofErr w:type="spellEnd"/>
-      <w:r>
-        <w:t xml:space="preserve"> </w:t>
-      </w:r>
-      <w:proofErr w:type="spellStart"/>
-      <w:r>
-        <w:t>računa</w:t>
-      </w:r>
-      <w:proofErr w:type="spellEnd"/>
-      <w:r>
-        <w:t xml:space="preserve"> da </w:t>
-      </w:r>
-      <w:proofErr w:type="spellStart"/>
-      <w:r>
-        <w:t>sistem</w:t>
-      </w:r>
-      <w:proofErr w:type="spellEnd"/>
-      <w:r>
-        <w:t xml:space="preserve"> </w:t>
-      </w:r>
-      <w:proofErr w:type="spellStart"/>
-      <w:r>
-        <w:t>može</w:t>
-      </w:r>
-      <w:proofErr w:type="spellEnd"/>
-      <w:r>
-        <w:t xml:space="preserve"> </w:t>
-      </w:r>
-      <w:proofErr w:type="spellStart"/>
-      <w:r>
-        <w:t>raditi</w:t>
-      </w:r>
-      <w:proofErr w:type="spellEnd"/>
-      <w:r>
-        <w:t xml:space="preserve"> </w:t>
-      </w:r>
-      <w:proofErr w:type="spellStart"/>
-      <w:proofErr w:type="gramStart"/>
-      <w:r>
-        <w:t>na</w:t>
-      </w:r>
-      <w:proofErr w:type="spellEnd"/>
-      <w:proofErr w:type="gramEnd"/>
       <w:r>
         <w:t xml:space="preserve"> </w:t>
       </w:r>
@@ -6292,7 +6309,6 @@
             <v:line id="_x0000_s1035" style="position:absolute;flip:x y" from="7461,3604" to="8721,3604">
               <v:stroke startarrow="block" endarrow="block"/>
             </v:line>
-            <w10:wrap type="none"/>
             <w10:anchorlock/>
           </v:group>
         </w:pict>
@@ -6417,14 +6433,7 @@
                         <w:b/>
                         <w:lang w:val="sr-Latn-CS"/>
                       </w:rPr>
-                      <w:t xml:space="preserve">/Mobilni </w:t>
-                    </w:r>
-                    <w:r>
-                      <w:rPr>
-                        <w:b/>
-                        <w:lang w:val="sr-Latn-CS"/>
-                      </w:rPr>
-                      <w:t>uređaj/Tablet</w:t>
+                      <w:t>/Mobilni uređaj/Tablet</w:t>
                     </w:r>
                   </w:p>
                   <w:p>
@@ -6512,7 +6521,6 @@
                 </w:txbxContent>
               </v:textbox>
             </v:shape>
-            <w10:wrap type="none"/>
             <w10:anchorlock/>
           </v:group>
         </w:pict>
@@ -6545,7 +6553,6 @@
           <w:b/>
           <w:lang w:val="sr-Latn-CS"/>
         </w:rPr>
-        <w:lastRenderedPageBreak/>
         <w:t>Slika</w:t>
       </w:r>
       <w:r>
@@ -7275,7 +7282,43 @@
         <w:rPr>
           <w:lang w:val="sr-Latn-CS"/>
         </w:rPr>
-        <w:t>Kako PeNcIL portal nije proizvod namenjen za šire tržište neće biti pravljen poseban instalacioni program. Ipak, potrebno je obezbediti automatizaciju procesa kreiranja baze podataka.</w:t>
+        <w:t xml:space="preserve">Kako </w:t>
+      </w:r>
+      <w:r>
+        <w:rPr>
+          <w:lang w:val="sr-Latn-CS"/>
+        </w:rPr>
+        <w:t>TasKing</w:t>
+      </w:r>
+      <w:r>
+        <w:rPr>
+          <w:lang w:val="sr-Latn-CS"/>
+        </w:rPr>
+        <w:t xml:space="preserve"> </w:t>
+      </w:r>
+      <w:r>
+        <w:rPr>
+          <w:lang w:val="sr-Latn-CS"/>
+        </w:rPr>
+        <w:t>aplikacija</w:t>
+      </w:r>
+      <w:r>
+        <w:rPr>
+          <w:lang w:val="sr-Latn-CS"/>
+        </w:rPr>
+        <w:t xml:space="preserve"> nije proizvod namenjen</w:t>
+      </w:r>
+      <w:r>
+        <w:rPr>
+          <w:lang w:val="sr-Latn-CS"/>
+        </w:rPr>
+        <w:t>a</w:t>
+      </w:r>
+      <w:r>
+        <w:rPr>
+          <w:lang w:val="sr-Latn-CS"/>
+        </w:rPr>
+        <w:t xml:space="preserve"> za šire tržište neće biti pravljen poseban instalacioni program. Ipak, potrebno je obezbediti automatizaciju procesa kreiranja baze podataka.</w:t>
       </w:r>
     </w:p>
     <w:p>
@@ -7290,6 +7333,7 @@
         <w:rPr>
           <w:lang w:val="sr-Latn-CS"/>
         </w:rPr>
+        <w:lastRenderedPageBreak/>
         <w:t>Funkcionalni zahtevi</w:t>
       </w:r>
       <w:bookmarkEnd w:id="20"/>
@@ -7482,7 +7526,6 @@
         <w:rPr>
           <w:lang w:val="sr-Latn-CS"/>
         </w:rPr>
-        <w:lastRenderedPageBreak/>
         <w:t>Kreiranje</w:t>
       </w:r>
       <w:r>
@@ -8040,6 +8083,7 @@
         <w:rPr>
           <w:lang w:val="sr-Latn-CS"/>
         </w:rPr>
+        <w:lastRenderedPageBreak/>
         <w:t>Nefunkcionalni zahtevi</w:t>
       </w:r>
       <w:bookmarkEnd w:id="29"/>
@@ -8202,7 +8246,6 @@
         <w:rPr>
           <w:lang w:val="sr-Latn-CS"/>
         </w:rPr>
-        <w:lastRenderedPageBreak/>
         <w:t>Zahtevi u pogledu okruženja</w:t>
       </w:r>
       <w:bookmarkEnd w:id="32"/>
@@ -8388,10 +8431,10 @@
       </w:r>
     </w:p>
     <w:sectPr>
-      <w:headerReference w:type="default" r:id="rId10"/>
-      <w:footerReference w:type="default" r:id="rId11"/>
-      <w:headerReference w:type="first" r:id="rId12"/>
-      <w:footerReference w:type="first" r:id="rId13"/>
+      <w:headerReference w:type="default" r:id="rId9"/>
+      <w:footerReference w:type="default" r:id="rId10"/>
+      <w:headerReference w:type="first" r:id="rId11"/>
+      <w:footerReference w:type="first" r:id="rId12"/>
       <w:pgSz w:w="12240" w:h="15840" w:code="1"/>
       <w:pgMar w:top="1440" w:right="1440" w:bottom="1440" w:left="1440" w:header="708" w:footer="708" w:gutter="0"/>
       <w:cols w:space="708"/>
@@ -8401,7 +8444,7 @@
 </file>
 
 <file path=word/endnotes.xml><?xml version="1.0" encoding="utf-8"?>
-<w:endnotes xmlns:wpc="http://schemas.microsoft.com/office/word/2010/wordprocessingCanvas" xmlns:mc="http://schemas.openxmlformats.org/markup-compatibility/2006" xmlns:o="urn:schemas-microsoft-com:office:office" xmlns:r="http://schemas.openxmlformats.org/officeDocument/2006/relationships" xmlns:m="http://schemas.openxmlformats.org/officeDocument/2006/math" xmlns:v="urn:schemas-microsoft-com:vml" xmlns:wp14="http://schemas.microsoft.com/office/word/2010/wordprocessingDrawing" xmlns:wp="http://schemas.openxmlformats.org/drawingml/2006/wordprocessingDrawing" xmlns:w10="urn:schemas-microsoft-com:office:word" xmlns:w="http://schemas.openxmlformats.org/wordprocessingml/2006/main" xmlns:w14="http://schemas.microsoft.com/office/word/2010/wordml" xmlns:wpg="http://schemas.microsoft.com/office/word/2010/wordprocessingGroup" xmlns:wpi="http://schemas.microsoft.com/office/word/2010/wordprocessingInk" xmlns:wne="http://schemas.microsoft.com/office/word/2006/wordml" xmlns:wps="http://schemas.microsoft.com/office/word/2010/wordprocessingShape" mc:Ignorable="w14 wp14">
+<w:endnotes xmlns:wpc="http://schemas.microsoft.com/office/word/2010/wordprocessingCanvas" xmlns:cx="http://schemas.microsoft.com/office/drawing/2014/chartex" xmlns:cx1="http://schemas.microsoft.com/office/drawing/2015/9/8/chartex" xmlns:cx2="http://schemas.microsoft.com/office/drawing/2015/10/21/chartex" xmlns:cx3="http://schemas.microsoft.com/office/drawing/2016/5/9/chartex" xmlns:cx4="http://schemas.microsoft.com/office/drawing/2016/5/10/chartex" xmlns:cx5="http://schemas.microsoft.com/office/drawing/2016/5/11/chartex" xmlns:cx6="http://schemas.microsoft.com/office/drawing/2016/5/12/chartex" xmlns:cx7="http://schemas.microsoft.com/office/drawing/2016/5/13/chartex" xmlns:cx8="http://schemas.microsoft.com/office/drawing/2016/5/14/chartex" xmlns:mc="http://schemas.openxmlformats.org/markup-compatibility/2006" xmlns:aink="http://schemas.microsoft.com/office/drawing/2016/ink" xmlns:am3d="http://schemas.microsoft.com/office/drawing/2017/model3d" xmlns:o="urn:schemas-microsoft-com:office:office" xmlns:r="http://schemas.openxmlformats.org/officeDocument/2006/relationships" xmlns:m="http://schemas.openxmlformats.org/officeDocument/2006/math" xmlns:v="urn:schemas-microsoft-com:vml" xmlns:wp14="http://schemas.microsoft.com/office/word/2010/wordprocessingDrawing" xmlns:wp="http://schemas.openxmlformats.org/drawingml/2006/wordprocessingDrawing" xmlns:w10="urn:schemas-microsoft-com:office:word" xmlns:w="http://schemas.openxmlformats.org/wordprocessingml/2006/main" xmlns:w14="http://schemas.microsoft.com/office/word/2010/wordml" xmlns:w15="http://schemas.microsoft.com/office/word/2012/wordml" xmlns:w16cid="http://schemas.microsoft.com/office/word/2016/wordml/cid" xmlns:w16se="http://schemas.microsoft.com/office/word/2015/wordml/symex" xmlns:wpg="http://schemas.microsoft.com/office/word/2010/wordprocessingGroup" xmlns:wpi="http://schemas.microsoft.com/office/word/2010/wordprocessingInk" xmlns:wne="http://schemas.microsoft.com/office/word/2006/wordml" xmlns:wps="http://schemas.microsoft.com/office/word/2010/wordprocessingShape" mc:Ignorable="w14 w15 w16se w16cid wp14">
   <w:endnote w:type="separator" w:id="-1">
     <w:p>
       <w:r>
@@ -8420,7 +8463,7 @@
 </file>
 
 <file path=word/footer1.xml><?xml version="1.0" encoding="utf-8"?>
-<w:ftr xmlns:wpc="http://schemas.microsoft.com/office/word/2010/wordprocessingCanvas" xmlns:mc="http://schemas.openxmlformats.org/markup-compatibility/2006" xmlns:o="urn:schemas-microsoft-com:office:office" xmlns:r="http://schemas.openxmlformats.org/officeDocument/2006/relationships" xmlns:m="http://schemas.openxmlformats.org/officeDocument/2006/math" xmlns:v="urn:schemas-microsoft-com:vml" xmlns:wp14="http://schemas.microsoft.com/office/word/2010/wordprocessingDrawing" xmlns:wp="http://schemas.openxmlformats.org/drawingml/2006/wordprocessingDrawing" xmlns:w10="urn:schemas-microsoft-com:office:word" xmlns:w="http://schemas.openxmlformats.org/wordprocessingml/2006/main" xmlns:w14="http://schemas.microsoft.com/office/word/2010/wordml" xmlns:wpg="http://schemas.microsoft.com/office/word/2010/wordprocessingGroup" xmlns:wpi="http://schemas.microsoft.com/office/word/2010/wordprocessingInk" xmlns:wne="http://schemas.microsoft.com/office/word/2006/wordml" xmlns:wps="http://schemas.microsoft.com/office/word/2010/wordprocessingShape" mc:Ignorable="w14 wp14">
+<w:ftr xmlns:wpc="http://schemas.microsoft.com/office/word/2010/wordprocessingCanvas" xmlns:cx="http://schemas.microsoft.com/office/drawing/2014/chartex" xmlns:cx1="http://schemas.microsoft.com/office/drawing/2015/9/8/chartex" xmlns:cx2="http://schemas.microsoft.com/office/drawing/2015/10/21/chartex" xmlns:cx3="http://schemas.microsoft.com/office/drawing/2016/5/9/chartex" xmlns:cx4="http://schemas.microsoft.com/office/drawing/2016/5/10/chartex" xmlns:cx5="http://schemas.microsoft.com/office/drawing/2016/5/11/chartex" xmlns:cx6="http://schemas.microsoft.com/office/drawing/2016/5/12/chartex" xmlns:cx7="http://schemas.microsoft.com/office/drawing/2016/5/13/chartex" xmlns:cx8="http://schemas.microsoft.com/office/drawing/2016/5/14/chartex" xmlns:mc="http://schemas.openxmlformats.org/markup-compatibility/2006" xmlns:aink="http://schemas.microsoft.com/office/drawing/2016/ink" xmlns:am3d="http://schemas.microsoft.com/office/drawing/2017/model3d" xmlns:o="urn:schemas-microsoft-com:office:office" xmlns:r="http://schemas.openxmlformats.org/officeDocument/2006/relationships" xmlns:m="http://schemas.openxmlformats.org/officeDocument/2006/math" xmlns:v="urn:schemas-microsoft-com:vml" xmlns:wp14="http://schemas.microsoft.com/office/word/2010/wordprocessingDrawing" xmlns:wp="http://schemas.openxmlformats.org/drawingml/2006/wordprocessingDrawing" xmlns:w10="urn:schemas-microsoft-com:office:word" xmlns:w="http://schemas.openxmlformats.org/wordprocessingml/2006/main" xmlns:w14="http://schemas.microsoft.com/office/word/2010/wordml" xmlns:w15="http://schemas.microsoft.com/office/word/2012/wordml" xmlns:w16cid="http://schemas.microsoft.com/office/word/2016/wordml/cid" xmlns:w16se="http://schemas.microsoft.com/office/word/2015/wordml/symex" xmlns:wpg="http://schemas.microsoft.com/office/word/2010/wordprocessingGroup" xmlns:wpi="http://schemas.microsoft.com/office/word/2010/wordprocessingInk" xmlns:wne="http://schemas.microsoft.com/office/word/2006/wordml" xmlns:wps="http://schemas.microsoft.com/office/word/2010/wordprocessingShape" mc:Ignorable="w14 w15 w16se w16cid wp14">
   <w:p>
     <w:pPr>
       <w:pStyle w:val="Footer"/>
@@ -8458,7 +8501,7 @@
 </file>
 
 <file path=word/footer2.xml><?xml version="1.0" encoding="utf-8"?>
-<w:ftr xmlns:wpc="http://schemas.microsoft.com/office/word/2010/wordprocessingCanvas" xmlns:mc="http://schemas.openxmlformats.org/markup-compatibility/2006" xmlns:o="urn:schemas-microsoft-com:office:office" xmlns:r="http://schemas.openxmlformats.org/officeDocument/2006/relationships" xmlns:m="http://schemas.openxmlformats.org/officeDocument/2006/math" xmlns:v="urn:schemas-microsoft-com:vml" xmlns:wp14="http://schemas.microsoft.com/office/word/2010/wordprocessingDrawing" xmlns:wp="http://schemas.openxmlformats.org/drawingml/2006/wordprocessingDrawing" xmlns:w10="urn:schemas-microsoft-com:office:word" xmlns:w="http://schemas.openxmlformats.org/wordprocessingml/2006/main" xmlns:w14="http://schemas.microsoft.com/office/word/2010/wordml" xmlns:wpg="http://schemas.microsoft.com/office/word/2010/wordprocessingGroup" xmlns:wpi="http://schemas.microsoft.com/office/word/2010/wordprocessingInk" xmlns:wne="http://schemas.microsoft.com/office/word/2006/wordml" xmlns:wps="http://schemas.microsoft.com/office/word/2010/wordprocessingShape" mc:Ignorable="w14 wp14">
+<w:ftr xmlns:wpc="http://schemas.microsoft.com/office/word/2010/wordprocessingCanvas" xmlns:cx="http://schemas.microsoft.com/office/drawing/2014/chartex" xmlns:cx1="http://schemas.microsoft.com/office/drawing/2015/9/8/chartex" xmlns:cx2="http://schemas.microsoft.com/office/drawing/2015/10/21/chartex" xmlns:cx3="http://schemas.microsoft.com/office/drawing/2016/5/9/chartex" xmlns:cx4="http://schemas.microsoft.com/office/drawing/2016/5/10/chartex" xmlns:cx5="http://schemas.microsoft.com/office/drawing/2016/5/11/chartex" xmlns:cx6="http://schemas.microsoft.com/office/drawing/2016/5/12/chartex" xmlns:cx7="http://schemas.microsoft.com/office/drawing/2016/5/13/chartex" xmlns:cx8="http://schemas.microsoft.com/office/drawing/2016/5/14/chartex" xmlns:mc="http://schemas.openxmlformats.org/markup-compatibility/2006" xmlns:aink="http://schemas.microsoft.com/office/drawing/2016/ink" xmlns:am3d="http://schemas.microsoft.com/office/drawing/2017/model3d" xmlns:o="urn:schemas-microsoft-com:office:office" xmlns:r="http://schemas.openxmlformats.org/officeDocument/2006/relationships" xmlns:m="http://schemas.openxmlformats.org/officeDocument/2006/math" xmlns:v="urn:schemas-microsoft-com:vml" xmlns:wp14="http://schemas.microsoft.com/office/word/2010/wordprocessingDrawing" xmlns:wp="http://schemas.openxmlformats.org/drawingml/2006/wordprocessingDrawing" xmlns:w10="urn:schemas-microsoft-com:office:word" xmlns:w="http://schemas.openxmlformats.org/wordprocessingml/2006/main" xmlns:w14="http://schemas.microsoft.com/office/word/2010/wordml" xmlns:w15="http://schemas.microsoft.com/office/word/2012/wordml" xmlns:w16cid="http://schemas.microsoft.com/office/word/2016/wordml/cid" xmlns:w16se="http://schemas.microsoft.com/office/word/2015/wordml/symex" xmlns:wpg="http://schemas.microsoft.com/office/word/2010/wordprocessingGroup" xmlns:wpi="http://schemas.microsoft.com/office/word/2010/wordprocessingInk" xmlns:wne="http://schemas.microsoft.com/office/word/2006/wordml" xmlns:wps="http://schemas.microsoft.com/office/word/2010/wordprocessingShape" mc:Ignorable="w14 w15 w16se w16cid wp14">
   <w:tbl>
     <w:tblPr>
       <w:tblW w:w="0" w:type="auto"/>
@@ -8613,16 +8656,31 @@
             </w:rPr>
             <w:t xml:space="preserve"> od </w:t>
           </w:r>
-          <w:fldSimple w:instr=" NUMPAGES  \* MERGEFORMAT ">
-            <w:r>
-              <w:rPr>
-                <w:rStyle w:val="PageNumber"/>
-                <w:noProof/>
-                <w:lang w:val="sr-Latn-CS"/>
-              </w:rPr>
-              <w:t>10</w:t>
-            </w:r>
-          </w:fldSimple>
+          <w:r>
+            <w:fldChar w:fldCharType="begin"/>
+          </w:r>
+          <w:r>
+            <w:instrText xml:space="preserve"> NUMPAGES  \* MERGEFORMAT </w:instrText>
+          </w:r>
+          <w:r>
+            <w:fldChar w:fldCharType="separate"/>
+          </w:r>
+          <w:r>
+            <w:rPr>
+              <w:rStyle w:val="PageNumber"/>
+              <w:noProof/>
+              <w:lang w:val="sr-Latn-CS"/>
+            </w:rPr>
+            <w:t>10</w:t>
+          </w:r>
+          <w:r>
+            <w:rPr>
+              <w:rStyle w:val="PageNumber"/>
+              <w:noProof/>
+              <w:lang w:val="sr-Latn-CS"/>
+            </w:rPr>
+            <w:fldChar w:fldCharType="end"/>
+          </w:r>
         </w:p>
       </w:tc>
     </w:tr>
@@ -8639,7 +8697,7 @@
 </file>
 
 <file path=word/footer3.xml><?xml version="1.0" encoding="utf-8"?>
-<w:ftr xmlns:wpc="http://schemas.microsoft.com/office/word/2010/wordprocessingCanvas" xmlns:mc="http://schemas.openxmlformats.org/markup-compatibility/2006" xmlns:o="urn:schemas-microsoft-com:office:office" xmlns:r="http://schemas.openxmlformats.org/officeDocument/2006/relationships" xmlns:m="http://schemas.openxmlformats.org/officeDocument/2006/math" xmlns:v="urn:schemas-microsoft-com:vml" xmlns:wp14="http://schemas.microsoft.com/office/word/2010/wordprocessingDrawing" xmlns:wp="http://schemas.openxmlformats.org/drawingml/2006/wordprocessingDrawing" xmlns:w10="urn:schemas-microsoft-com:office:word" xmlns:w="http://schemas.openxmlformats.org/wordprocessingml/2006/main" xmlns:w14="http://schemas.microsoft.com/office/word/2010/wordml" xmlns:wpg="http://schemas.microsoft.com/office/word/2010/wordprocessingGroup" xmlns:wpi="http://schemas.microsoft.com/office/word/2010/wordprocessingInk" xmlns:wne="http://schemas.microsoft.com/office/word/2006/wordml" xmlns:wps="http://schemas.microsoft.com/office/word/2010/wordprocessingShape" mc:Ignorable="w14 wp14">
+<w:ftr xmlns:wpc="http://schemas.microsoft.com/office/word/2010/wordprocessingCanvas" xmlns:cx="http://schemas.microsoft.com/office/drawing/2014/chartex" xmlns:cx1="http://schemas.microsoft.com/office/drawing/2015/9/8/chartex" xmlns:cx2="http://schemas.microsoft.com/office/drawing/2015/10/21/chartex" xmlns:cx3="http://schemas.microsoft.com/office/drawing/2016/5/9/chartex" xmlns:cx4="http://schemas.microsoft.com/office/drawing/2016/5/10/chartex" xmlns:cx5="http://schemas.microsoft.com/office/drawing/2016/5/11/chartex" xmlns:cx6="http://schemas.microsoft.com/office/drawing/2016/5/12/chartex" xmlns:cx7="http://schemas.microsoft.com/office/drawing/2016/5/13/chartex" xmlns:cx8="http://schemas.microsoft.com/office/drawing/2016/5/14/chartex" xmlns:mc="http://schemas.openxmlformats.org/markup-compatibility/2006" xmlns:aink="http://schemas.microsoft.com/office/drawing/2016/ink" xmlns:am3d="http://schemas.microsoft.com/office/drawing/2017/model3d" xmlns:o="urn:schemas-microsoft-com:office:office" xmlns:r="http://schemas.openxmlformats.org/officeDocument/2006/relationships" xmlns:m="http://schemas.openxmlformats.org/officeDocument/2006/math" xmlns:v="urn:schemas-microsoft-com:vml" xmlns:wp14="http://schemas.microsoft.com/office/word/2010/wordprocessingDrawing" xmlns:wp="http://schemas.openxmlformats.org/drawingml/2006/wordprocessingDrawing" xmlns:w10="urn:schemas-microsoft-com:office:word" xmlns:w="http://schemas.openxmlformats.org/wordprocessingml/2006/main" xmlns:w14="http://schemas.microsoft.com/office/word/2010/wordml" xmlns:w15="http://schemas.microsoft.com/office/word/2012/wordml" xmlns:w16cid="http://schemas.microsoft.com/office/word/2016/wordml/cid" xmlns:w16se="http://schemas.microsoft.com/office/word/2015/wordml/symex" xmlns:wpg="http://schemas.microsoft.com/office/word/2010/wordprocessingGroup" xmlns:wpi="http://schemas.microsoft.com/office/word/2010/wordprocessingInk" xmlns:wne="http://schemas.microsoft.com/office/word/2006/wordml" xmlns:wps="http://schemas.microsoft.com/office/word/2010/wordprocessingShape" mc:Ignorable="w14 w15 w16se w16cid wp14">
   <w:p>
     <w:pPr>
       <w:pStyle w:val="Footer"/>
@@ -8649,7 +8707,7 @@
 </file>
 
 <file path=word/footnotes.xml><?xml version="1.0" encoding="utf-8"?>
-<w:footnotes xmlns:wpc="http://schemas.microsoft.com/office/word/2010/wordprocessingCanvas" xmlns:mc="http://schemas.openxmlformats.org/markup-compatibility/2006" xmlns:o="urn:schemas-microsoft-com:office:office" xmlns:r="http://schemas.openxmlformats.org/officeDocument/2006/relationships" xmlns:m="http://schemas.openxmlformats.org/officeDocument/2006/math" xmlns:v="urn:schemas-microsoft-com:vml" xmlns:wp14="http://schemas.microsoft.com/office/word/2010/wordprocessingDrawing" xmlns:wp="http://schemas.openxmlformats.org/drawingml/2006/wordprocessingDrawing" xmlns:w10="urn:schemas-microsoft-com:office:word" xmlns:w="http://schemas.openxmlformats.org/wordprocessingml/2006/main" xmlns:w14="http://schemas.microsoft.com/office/word/2010/wordml" xmlns:wpg="http://schemas.microsoft.com/office/word/2010/wordprocessingGroup" xmlns:wpi="http://schemas.microsoft.com/office/word/2010/wordprocessingInk" xmlns:wne="http://schemas.microsoft.com/office/word/2006/wordml" xmlns:wps="http://schemas.microsoft.com/office/word/2010/wordprocessingShape" mc:Ignorable="w14 wp14">
+<w:footnotes xmlns:wpc="http://schemas.microsoft.com/office/word/2010/wordprocessingCanvas" xmlns:cx="http://schemas.microsoft.com/office/drawing/2014/chartex" xmlns:cx1="http://schemas.microsoft.com/office/drawing/2015/9/8/chartex" xmlns:cx2="http://schemas.microsoft.com/office/drawing/2015/10/21/chartex" xmlns:cx3="http://schemas.microsoft.com/office/drawing/2016/5/9/chartex" xmlns:cx4="http://schemas.microsoft.com/office/drawing/2016/5/10/chartex" xmlns:cx5="http://schemas.microsoft.com/office/drawing/2016/5/11/chartex" xmlns:cx6="http://schemas.microsoft.com/office/drawing/2016/5/12/chartex" xmlns:cx7="http://schemas.microsoft.com/office/drawing/2016/5/13/chartex" xmlns:cx8="http://schemas.microsoft.com/office/drawing/2016/5/14/chartex" xmlns:mc="http://schemas.openxmlformats.org/markup-compatibility/2006" xmlns:aink="http://schemas.microsoft.com/office/drawing/2016/ink" xmlns:am3d="http://schemas.microsoft.com/office/drawing/2017/model3d" xmlns:o="urn:schemas-microsoft-com:office:office" xmlns:r="http://schemas.openxmlformats.org/officeDocument/2006/relationships" xmlns:m="http://schemas.openxmlformats.org/officeDocument/2006/math" xmlns:v="urn:schemas-microsoft-com:vml" xmlns:wp14="http://schemas.microsoft.com/office/word/2010/wordprocessingDrawing" xmlns:wp="http://schemas.openxmlformats.org/drawingml/2006/wordprocessingDrawing" xmlns:w10="urn:schemas-microsoft-com:office:word" xmlns:w="http://schemas.openxmlformats.org/wordprocessingml/2006/main" xmlns:w14="http://schemas.microsoft.com/office/word/2010/wordml" xmlns:w15="http://schemas.microsoft.com/office/word/2012/wordml" xmlns:w16cid="http://schemas.microsoft.com/office/word/2016/wordml/cid" xmlns:w16se="http://schemas.microsoft.com/office/word/2015/wordml/symex" xmlns:wpg="http://schemas.microsoft.com/office/word/2010/wordprocessingGroup" xmlns:wpi="http://schemas.microsoft.com/office/word/2010/wordprocessingInk" xmlns:wne="http://schemas.microsoft.com/office/word/2006/wordml" xmlns:wps="http://schemas.microsoft.com/office/word/2010/wordprocessingShape" mc:Ignorable="w14 w15 w16se w16cid wp14">
   <w:footnote w:type="separator" w:id="-1">
     <w:p>
       <w:r>
@@ -8668,7 +8726,7 @@
 </file>
 
 <file path=word/header1.xml><?xml version="1.0" encoding="utf-8"?>
-<w:hdr xmlns:wpc="http://schemas.microsoft.com/office/word/2010/wordprocessingCanvas" xmlns:mc="http://schemas.openxmlformats.org/markup-compatibility/2006" xmlns:o="urn:schemas-microsoft-com:office:office" xmlns:r="http://schemas.openxmlformats.org/officeDocument/2006/relationships" xmlns:m="http://schemas.openxmlformats.org/officeDocument/2006/math" xmlns:v="urn:schemas-microsoft-com:vml" xmlns:wp14="http://schemas.microsoft.com/office/word/2010/wordprocessingDrawing" xmlns:wp="http://schemas.openxmlformats.org/drawingml/2006/wordprocessingDrawing" xmlns:w10="urn:schemas-microsoft-com:office:word" xmlns:w="http://schemas.openxmlformats.org/wordprocessingml/2006/main" xmlns:w14="http://schemas.microsoft.com/office/word/2010/wordml" xmlns:wpg="http://schemas.microsoft.com/office/word/2010/wordprocessingGroup" xmlns:wpi="http://schemas.microsoft.com/office/word/2010/wordprocessingInk" xmlns:wne="http://schemas.microsoft.com/office/word/2006/wordml" xmlns:wps="http://schemas.microsoft.com/office/word/2010/wordprocessingShape" mc:Ignorable="w14 wp14">
+<w:hdr xmlns:wpc="http://schemas.microsoft.com/office/word/2010/wordprocessingCanvas" xmlns:cx="http://schemas.microsoft.com/office/drawing/2014/chartex" xmlns:cx1="http://schemas.microsoft.com/office/drawing/2015/9/8/chartex" xmlns:cx2="http://schemas.microsoft.com/office/drawing/2015/10/21/chartex" xmlns:cx3="http://schemas.microsoft.com/office/drawing/2016/5/9/chartex" xmlns:cx4="http://schemas.microsoft.com/office/drawing/2016/5/10/chartex" xmlns:cx5="http://schemas.microsoft.com/office/drawing/2016/5/11/chartex" xmlns:cx6="http://schemas.microsoft.com/office/drawing/2016/5/12/chartex" xmlns:cx7="http://schemas.microsoft.com/office/drawing/2016/5/13/chartex" xmlns:cx8="http://schemas.microsoft.com/office/drawing/2016/5/14/chartex" xmlns:mc="http://schemas.openxmlformats.org/markup-compatibility/2006" xmlns:aink="http://schemas.microsoft.com/office/drawing/2016/ink" xmlns:am3d="http://schemas.microsoft.com/office/drawing/2017/model3d" xmlns:o="urn:schemas-microsoft-com:office:office" xmlns:r="http://schemas.openxmlformats.org/officeDocument/2006/relationships" xmlns:m="http://schemas.openxmlformats.org/officeDocument/2006/math" xmlns:v="urn:schemas-microsoft-com:vml" xmlns:wp14="http://schemas.microsoft.com/office/word/2010/wordprocessingDrawing" xmlns:wp="http://schemas.openxmlformats.org/drawingml/2006/wordprocessingDrawing" xmlns:w10="urn:schemas-microsoft-com:office:word" xmlns:w="http://schemas.openxmlformats.org/wordprocessingml/2006/main" xmlns:w14="http://schemas.microsoft.com/office/word/2010/wordml" xmlns:w15="http://schemas.microsoft.com/office/word/2012/wordml" xmlns:w16cid="http://schemas.microsoft.com/office/word/2016/wordml/cid" xmlns:w16se="http://schemas.microsoft.com/office/word/2015/wordml/symex" xmlns:wpg="http://schemas.microsoft.com/office/word/2010/wordprocessingGroup" xmlns:wpi="http://schemas.microsoft.com/office/word/2010/wordprocessingInk" xmlns:wne="http://schemas.microsoft.com/office/word/2006/wordml" xmlns:wps="http://schemas.microsoft.com/office/word/2010/wordprocessingShape" mc:Ignorable="w14 w15 w16se w16cid wp14">
   <w:p>
     <w:pPr>
       <w:rPr>
@@ -8717,7 +8775,7 @@
 </file>
 
 <file path=word/header2.xml><?xml version="1.0" encoding="utf-8"?>
-<w:hdr xmlns:wpc="http://schemas.microsoft.com/office/word/2010/wordprocessingCanvas" xmlns:mc="http://schemas.openxmlformats.org/markup-compatibility/2006" xmlns:o="urn:schemas-microsoft-com:office:office" xmlns:r="http://schemas.openxmlformats.org/officeDocument/2006/relationships" xmlns:m="http://schemas.openxmlformats.org/officeDocument/2006/math" xmlns:v="urn:schemas-microsoft-com:vml" xmlns:wp14="http://schemas.microsoft.com/office/word/2010/wordprocessingDrawing" xmlns:wp="http://schemas.openxmlformats.org/drawingml/2006/wordprocessingDrawing" xmlns:w10="urn:schemas-microsoft-com:office:word" xmlns:w="http://schemas.openxmlformats.org/wordprocessingml/2006/main" xmlns:w14="http://schemas.microsoft.com/office/word/2010/wordml" xmlns:wpg="http://schemas.microsoft.com/office/word/2010/wordprocessingGroup" xmlns:wpi="http://schemas.microsoft.com/office/word/2010/wordprocessingInk" xmlns:wne="http://schemas.microsoft.com/office/word/2006/wordml" xmlns:wps="http://schemas.microsoft.com/office/word/2010/wordprocessingShape" mc:Ignorable="w14 wp14">
+<w:hdr xmlns:wpc="http://schemas.microsoft.com/office/word/2010/wordprocessingCanvas" xmlns:cx="http://schemas.microsoft.com/office/drawing/2014/chartex" xmlns:cx1="http://schemas.microsoft.com/office/drawing/2015/9/8/chartex" xmlns:cx2="http://schemas.microsoft.com/office/drawing/2015/10/21/chartex" xmlns:cx3="http://schemas.microsoft.com/office/drawing/2016/5/9/chartex" xmlns:cx4="http://schemas.microsoft.com/office/drawing/2016/5/10/chartex" xmlns:cx5="http://schemas.microsoft.com/office/drawing/2016/5/11/chartex" xmlns:cx6="http://schemas.microsoft.com/office/drawing/2016/5/12/chartex" xmlns:cx7="http://schemas.microsoft.com/office/drawing/2016/5/13/chartex" xmlns:cx8="http://schemas.microsoft.com/office/drawing/2016/5/14/chartex" xmlns:mc="http://schemas.openxmlformats.org/markup-compatibility/2006" xmlns:aink="http://schemas.microsoft.com/office/drawing/2016/ink" xmlns:am3d="http://schemas.microsoft.com/office/drawing/2017/model3d" xmlns:o="urn:schemas-microsoft-com:office:office" xmlns:r="http://schemas.openxmlformats.org/officeDocument/2006/relationships" xmlns:m="http://schemas.openxmlformats.org/officeDocument/2006/math" xmlns:v="urn:schemas-microsoft-com:vml" xmlns:wp14="http://schemas.microsoft.com/office/word/2010/wordprocessingDrawing" xmlns:wp="http://schemas.openxmlformats.org/drawingml/2006/wordprocessingDrawing" xmlns:w10="urn:schemas-microsoft-com:office:word" xmlns:w="http://schemas.openxmlformats.org/wordprocessingml/2006/main" xmlns:w14="http://schemas.microsoft.com/office/word/2010/wordml" xmlns:w15="http://schemas.microsoft.com/office/word/2012/wordml" xmlns:w16cid="http://schemas.microsoft.com/office/word/2016/wordml/cid" xmlns:w16se="http://schemas.microsoft.com/office/word/2015/wordml/symex" xmlns:wpg="http://schemas.microsoft.com/office/word/2010/wordprocessingGroup" xmlns:wpi="http://schemas.microsoft.com/office/word/2010/wordprocessingInk" xmlns:wne="http://schemas.microsoft.com/office/word/2006/wordml" xmlns:wps="http://schemas.microsoft.com/office/word/2010/wordprocessingShape" mc:Ignorable="w14 w15 w16se w16cid wp14">
   <w:tbl>
     <w:tblPr>
       <w:tblW w:w="0" w:type="auto"/>
@@ -8893,7 +8951,7 @@
 </file>
 
 <file path=word/header3.xml><?xml version="1.0" encoding="utf-8"?>
-<w:hdr xmlns:wpc="http://schemas.microsoft.com/office/word/2010/wordprocessingCanvas" xmlns:mc="http://schemas.openxmlformats.org/markup-compatibility/2006" xmlns:o="urn:schemas-microsoft-com:office:office" xmlns:r="http://schemas.openxmlformats.org/officeDocument/2006/relationships" xmlns:m="http://schemas.openxmlformats.org/officeDocument/2006/math" xmlns:v="urn:schemas-microsoft-com:vml" xmlns:wp14="http://schemas.microsoft.com/office/word/2010/wordprocessingDrawing" xmlns:wp="http://schemas.openxmlformats.org/drawingml/2006/wordprocessingDrawing" xmlns:w10="urn:schemas-microsoft-com:office:word" xmlns:w="http://schemas.openxmlformats.org/wordprocessingml/2006/main" xmlns:w14="http://schemas.microsoft.com/office/word/2010/wordml" xmlns:wpg="http://schemas.microsoft.com/office/word/2010/wordprocessingGroup" xmlns:wpi="http://schemas.microsoft.com/office/word/2010/wordprocessingInk" xmlns:wne="http://schemas.microsoft.com/office/word/2006/wordml" xmlns:wps="http://schemas.microsoft.com/office/word/2010/wordprocessingShape" mc:Ignorable="w14 wp14">
+<w:hdr xmlns:wpc="http://schemas.microsoft.com/office/word/2010/wordprocessingCanvas" xmlns:cx="http://schemas.microsoft.com/office/drawing/2014/chartex" xmlns:cx1="http://schemas.microsoft.com/office/drawing/2015/9/8/chartex" xmlns:cx2="http://schemas.microsoft.com/office/drawing/2015/10/21/chartex" xmlns:cx3="http://schemas.microsoft.com/office/drawing/2016/5/9/chartex" xmlns:cx4="http://schemas.microsoft.com/office/drawing/2016/5/10/chartex" xmlns:cx5="http://schemas.microsoft.com/office/drawing/2016/5/11/chartex" xmlns:cx6="http://schemas.microsoft.com/office/drawing/2016/5/12/chartex" xmlns:cx7="http://schemas.microsoft.com/office/drawing/2016/5/13/chartex" xmlns:cx8="http://schemas.microsoft.com/office/drawing/2016/5/14/chartex" xmlns:mc="http://schemas.openxmlformats.org/markup-compatibility/2006" xmlns:aink="http://schemas.microsoft.com/office/drawing/2016/ink" xmlns:am3d="http://schemas.microsoft.com/office/drawing/2017/model3d" xmlns:o="urn:schemas-microsoft-com:office:office" xmlns:r="http://schemas.openxmlformats.org/officeDocument/2006/relationships" xmlns:m="http://schemas.openxmlformats.org/officeDocument/2006/math" xmlns:v="urn:schemas-microsoft-com:vml" xmlns:wp14="http://schemas.microsoft.com/office/word/2010/wordprocessingDrawing" xmlns:wp="http://schemas.openxmlformats.org/drawingml/2006/wordprocessingDrawing" xmlns:w10="urn:schemas-microsoft-com:office:word" xmlns:w="http://schemas.openxmlformats.org/wordprocessingml/2006/main" xmlns:w14="http://schemas.microsoft.com/office/word/2010/wordml" xmlns:w15="http://schemas.microsoft.com/office/word/2012/wordml" xmlns:w16cid="http://schemas.microsoft.com/office/word/2016/wordml/cid" xmlns:w16se="http://schemas.microsoft.com/office/word/2015/wordml/symex" xmlns:wpg="http://schemas.microsoft.com/office/word/2010/wordprocessingGroup" xmlns:wpi="http://schemas.microsoft.com/office/word/2010/wordprocessingInk" xmlns:wne="http://schemas.microsoft.com/office/word/2006/wordml" xmlns:wps="http://schemas.microsoft.com/office/word/2010/wordprocessingShape" mc:Ignorable="w14 w15 w16se w16cid wp14">
   <w:p>
     <w:pPr>
       <w:pStyle w:val="Header"/>
@@ -8903,8 +8961,8 @@
 </file>
 
 <file path=word/numbering.xml><?xml version="1.0" encoding="utf-8"?>
-<w:numbering xmlns:wpc="http://schemas.microsoft.com/office/word/2010/wordprocessingCanvas" xmlns:mc="http://schemas.openxmlformats.org/markup-compatibility/2006" xmlns:o="urn:schemas-microsoft-com:office:office" xmlns:r="http://schemas.openxmlformats.org/officeDocument/2006/relationships" xmlns:m="http://schemas.openxmlformats.org/officeDocument/2006/math" xmlns:v="urn:schemas-microsoft-com:vml" xmlns:wp14="http://schemas.microsoft.com/office/word/2010/wordprocessingDrawing" xmlns:wp="http://schemas.openxmlformats.org/drawingml/2006/wordprocessingDrawing" xmlns:w10="urn:schemas-microsoft-com:office:word" xmlns:w="http://schemas.openxmlformats.org/wordprocessingml/2006/main" xmlns:w14="http://schemas.microsoft.com/office/word/2010/wordml" xmlns:wpg="http://schemas.microsoft.com/office/word/2010/wordprocessingGroup" xmlns:wpi="http://schemas.microsoft.com/office/word/2010/wordprocessingInk" xmlns:wne="http://schemas.microsoft.com/office/word/2006/wordml" xmlns:wps="http://schemas.microsoft.com/office/word/2010/wordprocessingShape" mc:Ignorable="w14 wp14">
-  <w:abstractNum w:abstractNumId="0">
+<w:numbering xmlns:wpc="http://schemas.microsoft.com/office/word/2010/wordprocessingCanvas" xmlns:cx="http://schemas.microsoft.com/office/drawing/2014/chartex" xmlns:cx1="http://schemas.microsoft.com/office/drawing/2015/9/8/chartex" xmlns:cx2="http://schemas.microsoft.com/office/drawing/2015/10/21/chartex" xmlns:cx3="http://schemas.microsoft.com/office/drawing/2016/5/9/chartex" xmlns:cx4="http://schemas.microsoft.com/office/drawing/2016/5/10/chartex" xmlns:cx5="http://schemas.microsoft.com/office/drawing/2016/5/11/chartex" xmlns:cx6="http://schemas.microsoft.com/office/drawing/2016/5/12/chartex" xmlns:cx7="http://schemas.microsoft.com/office/drawing/2016/5/13/chartex" xmlns:cx8="http://schemas.microsoft.com/office/drawing/2016/5/14/chartex" xmlns:mc="http://schemas.openxmlformats.org/markup-compatibility/2006" xmlns:aink="http://schemas.microsoft.com/office/drawing/2016/ink" xmlns:am3d="http://schemas.microsoft.com/office/drawing/2017/model3d" xmlns:o="urn:schemas-microsoft-com:office:office" xmlns:r="http://schemas.openxmlformats.org/officeDocument/2006/relationships" xmlns:m="http://schemas.openxmlformats.org/officeDocument/2006/math" xmlns:v="urn:schemas-microsoft-com:vml" xmlns:wp14="http://schemas.microsoft.com/office/word/2010/wordprocessingDrawing" xmlns:wp="http://schemas.openxmlformats.org/drawingml/2006/wordprocessingDrawing" xmlns:w10="urn:schemas-microsoft-com:office:word" xmlns:w="http://schemas.openxmlformats.org/wordprocessingml/2006/main" xmlns:w14="http://schemas.microsoft.com/office/word/2010/wordml" xmlns:w15="http://schemas.microsoft.com/office/word/2012/wordml" xmlns:w16cid="http://schemas.microsoft.com/office/word/2016/wordml/cid" xmlns:w16se="http://schemas.microsoft.com/office/word/2015/wordml/symex" xmlns:wpg="http://schemas.microsoft.com/office/word/2010/wordprocessingGroup" xmlns:wpi="http://schemas.microsoft.com/office/word/2010/wordprocessingInk" xmlns:wne="http://schemas.microsoft.com/office/word/2006/wordml" xmlns:wps="http://schemas.microsoft.com/office/word/2010/wordprocessingShape" mc:Ignorable="w14 w15 w16se w16cid wp14">
+  <w:abstractNum w:abstractNumId="0" w15:restartNumberingAfterBreak="0">
     <w:nsid w:val="FFFFFFFB"/>
     <w:multiLevelType w:val="multilevel"/>
     <w:tmpl w:val="3CE8E716"/>
@@ -8984,7 +9042,7 @@
       <w:lvlJc w:val="left"/>
     </w:lvl>
   </w:abstractNum>
-  <w:abstractNum w:abstractNumId="1">
+  <w:abstractNum w:abstractNumId="1" w15:restartNumberingAfterBreak="0">
     <w:nsid w:val="FFFFFFFE"/>
     <w:multiLevelType w:val="singleLevel"/>
     <w:tmpl w:val="FFFFFFFF"/>
@@ -8994,7 +9052,7 @@
       <w:lvlJc w:val="left"/>
     </w:lvl>
   </w:abstractNum>
-  <w:abstractNum w:abstractNumId="2">
+  <w:abstractNum w:abstractNumId="2" w15:restartNumberingAfterBreak="0">
     <w:nsid w:val="015E1E6E"/>
     <w:multiLevelType w:val="singleLevel"/>
     <w:tmpl w:val="04090001"/>
@@ -9014,7 +9072,7 @@
       </w:rPr>
     </w:lvl>
   </w:abstractNum>
-  <w:abstractNum w:abstractNumId="3">
+  <w:abstractNum w:abstractNumId="3" w15:restartNumberingAfterBreak="0">
     <w:nsid w:val="1648782D"/>
     <w:multiLevelType w:val="singleLevel"/>
     <w:tmpl w:val="04090001"/>
@@ -9034,7 +9092,7 @@
       </w:rPr>
     </w:lvl>
   </w:abstractNum>
-  <w:abstractNum w:abstractNumId="4">
+  <w:abstractNum w:abstractNumId="4" w15:restartNumberingAfterBreak="0">
     <w:nsid w:val="18040BC0"/>
     <w:multiLevelType w:val="singleLevel"/>
     <w:tmpl w:val="04090001"/>
@@ -9054,7 +9112,7 @@
       </w:rPr>
     </w:lvl>
   </w:abstractNum>
-  <w:abstractNum w:abstractNumId="5">
+  <w:abstractNum w:abstractNumId="5" w15:restartNumberingAfterBreak="0">
     <w:nsid w:val="18D257AA"/>
     <w:multiLevelType w:val="singleLevel"/>
     <w:tmpl w:val="04090001"/>
@@ -9074,7 +9132,7 @@
       </w:rPr>
     </w:lvl>
   </w:abstractNum>
-  <w:abstractNum w:abstractNumId="6">
+  <w:abstractNum w:abstractNumId="6" w15:restartNumberingAfterBreak="0">
     <w:nsid w:val="1C965BB1"/>
     <w:multiLevelType w:val="singleLevel"/>
     <w:tmpl w:val="04090001"/>
@@ -9094,7 +9152,7 @@
       </w:rPr>
     </w:lvl>
   </w:abstractNum>
-  <w:abstractNum w:abstractNumId="7">
+  <w:abstractNum w:abstractNumId="7" w15:restartNumberingAfterBreak="0">
     <w:nsid w:val="208371BD"/>
     <w:multiLevelType w:val="singleLevel"/>
     <w:tmpl w:val="5442C4B8"/>
@@ -9114,7 +9172,7 @@
       </w:rPr>
     </w:lvl>
   </w:abstractNum>
-  <w:abstractNum w:abstractNumId="8">
+  <w:abstractNum w:abstractNumId="8" w15:restartNumberingAfterBreak="0">
     <w:nsid w:val="2709478A"/>
     <w:multiLevelType w:val="singleLevel"/>
     <w:tmpl w:val="04090001"/>
@@ -9134,7 +9192,7 @@
       </w:rPr>
     </w:lvl>
   </w:abstractNum>
-  <w:abstractNum w:abstractNumId="9">
+  <w:abstractNum w:abstractNumId="9" w15:restartNumberingAfterBreak="0">
     <w:nsid w:val="2A134E0D"/>
     <w:multiLevelType w:val="singleLevel"/>
     <w:tmpl w:val="2EA4D640"/>
@@ -9154,7 +9212,7 @@
       </w:rPr>
     </w:lvl>
   </w:abstractNum>
-  <w:abstractNum w:abstractNumId="10">
+  <w:abstractNum w:abstractNumId="10" w15:restartNumberingAfterBreak="0">
     <w:nsid w:val="31CD4C10"/>
     <w:multiLevelType w:val="singleLevel"/>
     <w:tmpl w:val="67942FBA"/>
@@ -9174,7 +9232,7 @@
       </w:rPr>
     </w:lvl>
   </w:abstractNum>
-  <w:abstractNum w:abstractNumId="11">
+  <w:abstractNum w:abstractNumId="11" w15:restartNumberingAfterBreak="0">
     <w:nsid w:val="3FE325F3"/>
     <w:multiLevelType w:val="singleLevel"/>
     <w:tmpl w:val="04090001"/>
@@ -9194,7 +9252,7 @@
       </w:rPr>
     </w:lvl>
   </w:abstractNum>
-  <w:abstractNum w:abstractNumId="12">
+  <w:abstractNum w:abstractNumId="12" w15:restartNumberingAfterBreak="0">
     <w:nsid w:val="44187E8C"/>
     <w:multiLevelType w:val="hybridMultilevel"/>
     <w:tmpl w:val="15141870"/>
@@ -9334,7 +9392,7 @@
       </w:rPr>
     </w:lvl>
   </w:abstractNum>
-  <w:abstractNum w:abstractNumId="13">
+  <w:abstractNum w:abstractNumId="13" w15:restartNumberingAfterBreak="0">
     <w:nsid w:val="536E6231"/>
     <w:multiLevelType w:val="singleLevel"/>
     <w:tmpl w:val="0409000F"/>
@@ -9351,7 +9409,7 @@
       </w:pPr>
     </w:lvl>
   </w:abstractNum>
-  <w:abstractNum w:abstractNumId="14">
+  <w:abstractNum w:abstractNumId="14" w15:restartNumberingAfterBreak="0">
     <w:nsid w:val="589D5412"/>
     <w:multiLevelType w:val="singleLevel"/>
     <w:tmpl w:val="04090001"/>
@@ -9371,7 +9429,7 @@
       </w:rPr>
     </w:lvl>
   </w:abstractNum>
-  <w:abstractNum w:abstractNumId="15">
+  <w:abstractNum w:abstractNumId="15" w15:restartNumberingAfterBreak="0">
     <w:nsid w:val="5BCC62C2"/>
     <w:multiLevelType w:val="singleLevel"/>
     <w:tmpl w:val="04090001"/>
@@ -9391,7 +9449,7 @@
       </w:rPr>
     </w:lvl>
   </w:abstractNum>
-  <w:abstractNum w:abstractNumId="16">
+  <w:abstractNum w:abstractNumId="16" w15:restartNumberingAfterBreak="0">
     <w:nsid w:val="62E94878"/>
     <w:multiLevelType w:val="singleLevel"/>
     <w:tmpl w:val="0409000F"/>
@@ -9408,7 +9466,7 @@
       </w:pPr>
     </w:lvl>
   </w:abstractNum>
-  <w:abstractNum w:abstractNumId="17">
+  <w:abstractNum w:abstractNumId="17" w15:restartNumberingAfterBreak="0">
     <w:nsid w:val="6F973B35"/>
     <w:multiLevelType w:val="singleLevel"/>
     <w:tmpl w:val="0409000F"/>
@@ -9425,7 +9483,7 @@
       </w:pPr>
     </w:lvl>
   </w:abstractNum>
-  <w:abstractNum w:abstractNumId="18">
+  <w:abstractNum w:abstractNumId="18" w15:restartNumberingAfterBreak="0">
     <w:nsid w:val="6FAD17FE"/>
     <w:multiLevelType w:val="singleLevel"/>
     <w:tmpl w:val="2CF284F0"/>
@@ -9445,7 +9503,7 @@
       </w:rPr>
     </w:lvl>
   </w:abstractNum>
-  <w:abstractNum w:abstractNumId="19">
+  <w:abstractNum w:abstractNumId="19" w15:restartNumberingAfterBreak="0">
     <w:nsid w:val="7AC953DF"/>
     <w:multiLevelType w:val="multilevel"/>
     <w:tmpl w:val="FFFFFFFF"/>
@@ -9628,7 +9686,7 @@
 </file>
 
 <file path=word/styles.xml><?xml version="1.0" encoding="utf-8"?>
-<w:styles xmlns:mc="http://schemas.openxmlformats.org/markup-compatibility/2006" xmlns:r="http://schemas.openxmlformats.org/officeDocument/2006/relationships" xmlns:w="http://schemas.openxmlformats.org/wordprocessingml/2006/main" xmlns:w14="http://schemas.microsoft.com/office/word/2010/wordml" mc:Ignorable="w14">
+<w:styles xmlns:mc="http://schemas.openxmlformats.org/markup-compatibility/2006" xmlns:r="http://schemas.openxmlformats.org/officeDocument/2006/relationships" xmlns:w="http://schemas.openxmlformats.org/wordprocessingml/2006/main" xmlns:w14="http://schemas.microsoft.com/office/word/2010/wordml" xmlns:w15="http://schemas.microsoft.com/office/word/2012/wordml" xmlns:w16cid="http://schemas.microsoft.com/office/word/2016/wordml/cid" xmlns:w16se="http://schemas.microsoft.com/office/word/2015/wordml/symex" mc:Ignorable="w14 w15 w16se w16cid">
   <w:docDefaults>
     <w:rPrDefault>
       <w:rPr>
@@ -9638,146 +9696,376 @@
     </w:rPrDefault>
     <w:pPrDefault/>
   </w:docDefaults>
-  <w:latentStyles w:defLockedState="0" w:defUIPriority="0" w:defSemiHidden="1" w:defUnhideWhenUsed="1" w:defQFormat="0" w:count="267">
-    <w:lsdException w:name="Normal" w:semiHidden="0" w:unhideWhenUsed="0" w:qFormat="1"/>
-    <w:lsdException w:name="heading 1" w:semiHidden="0" w:unhideWhenUsed="0" w:qFormat="1"/>
-    <w:lsdException w:name="heading 2" w:qFormat="1"/>
-    <w:lsdException w:name="heading 3" w:qFormat="1"/>
-    <w:lsdException w:name="heading 4" w:qFormat="1"/>
-    <w:lsdException w:name="heading 5" w:qFormat="1"/>
-    <w:lsdException w:name="heading 6" w:qFormat="1"/>
-    <w:lsdException w:name="heading 7" w:qFormat="1"/>
-    <w:lsdException w:name="heading 8" w:qFormat="1"/>
-    <w:lsdException w:name="heading 9" w:qFormat="1"/>
-    <w:lsdException w:name="caption" w:qFormat="1"/>
-    <w:lsdException w:name="endnote text" w:semiHidden="0" w:unhideWhenUsed="0"/>
-    <w:lsdException w:name="toa heading" w:semiHidden="0" w:unhideWhenUsed="0"/>
-    <w:lsdException w:name="List" w:semiHidden="0" w:unhideWhenUsed="0"/>
-    <w:lsdException w:name="Title" w:semiHidden="0" w:unhideWhenUsed="0" w:qFormat="1"/>
-    <w:lsdException w:name="List Continue" w:semiHidden="0" w:unhideWhenUsed="0"/>
-    <w:lsdException w:name="List Continue 2" w:semiHidden="0" w:unhideWhenUsed="0"/>
-    <w:lsdException w:name="List Continue 3" w:semiHidden="0" w:unhideWhenUsed="0"/>
-    <w:lsdException w:name="List Continue 4" w:semiHidden="0" w:unhideWhenUsed="0"/>
-    <w:lsdException w:name="Subtitle" w:semiHidden="0" w:unhideWhenUsed="0" w:qFormat="1"/>
-    <w:lsdException w:name="Strong" w:semiHidden="0" w:unhideWhenUsed="0" w:qFormat="1"/>
-    <w:lsdException w:name="Emphasis" w:semiHidden="0" w:unhideWhenUsed="0" w:qFormat="1"/>
-    <w:lsdException w:name="Table Web 1" w:semiHidden="0" w:unhideWhenUsed="0"/>
-    <w:lsdException w:name="Table Web 2" w:semiHidden="0" w:unhideWhenUsed="0"/>
-    <w:lsdException w:name="Table Web 3" w:semiHidden="0" w:unhideWhenUsed="0"/>
-    <w:lsdException w:name="Balloon Text" w:semiHidden="0" w:unhideWhenUsed="0"/>
-    <w:lsdException w:name="Table Grid" w:semiHidden="0" w:unhideWhenUsed="0"/>
-    <w:lsdException w:name="Table Theme" w:semiHidden="0" w:unhideWhenUsed="0"/>
-    <w:lsdException w:name="Placeholder Text" w:uiPriority="99" w:unhideWhenUsed="0"/>
-    <w:lsdException w:name="No Spacing" w:semiHidden="0" w:uiPriority="1" w:unhideWhenUsed="0" w:qFormat="1"/>
-    <w:lsdException w:name="Light Shading" w:semiHidden="0" w:uiPriority="60" w:unhideWhenUsed="0"/>
-    <w:lsdException w:name="Light List" w:semiHidden="0" w:uiPriority="61" w:unhideWhenUsed="0"/>
-    <w:lsdException w:name="Light Grid" w:semiHidden="0" w:uiPriority="62" w:unhideWhenUsed="0"/>
-    <w:lsdException w:name="Medium Shading 1" w:semiHidden="0" w:uiPriority="63" w:unhideWhenUsed="0"/>
-    <w:lsdException w:name="Medium Shading 2" w:semiHidden="0" w:uiPriority="64" w:unhideWhenUsed="0"/>
-    <w:lsdException w:name="Medium List 1" w:semiHidden="0" w:uiPriority="65" w:unhideWhenUsed="0"/>
-    <w:lsdException w:name="Medium List 2" w:semiHidden="0" w:uiPriority="66" w:unhideWhenUsed="0"/>
-    <w:lsdException w:name="Medium Grid 1" w:semiHidden="0" w:uiPriority="67" w:unhideWhenUsed="0"/>
-    <w:lsdException w:name="Medium Grid 2" w:semiHidden="0" w:uiPriority="68" w:unhideWhenUsed="0"/>
-    <w:lsdException w:name="Medium Grid 3" w:semiHidden="0" w:uiPriority="69" w:unhideWhenUsed="0"/>
-    <w:lsdException w:name="Dark List" w:semiHidden="0" w:uiPriority="70" w:unhideWhenUsed="0"/>
-    <w:lsdException w:name="Colorful Shading" w:semiHidden="0" w:uiPriority="71" w:unhideWhenUsed="0"/>
-    <w:lsdException w:name="Colorful List" w:semiHidden="0" w:uiPriority="72" w:unhideWhenUsed="0"/>
-    <w:lsdException w:name="Colorful Grid" w:semiHidden="0" w:uiPriority="73" w:unhideWhenUsed="0"/>
-    <w:lsdException w:name="Light Shading Accent 1" w:semiHidden="0" w:uiPriority="60" w:unhideWhenUsed="0"/>
-    <w:lsdException w:name="Light List Accent 1" w:semiHidden="0" w:uiPriority="61" w:unhideWhenUsed="0"/>
-    <w:lsdException w:name="Light Grid Accent 1" w:semiHidden="0" w:uiPriority="62" w:unhideWhenUsed="0"/>
-    <w:lsdException w:name="Medium Shading 1 Accent 1" w:semiHidden="0" w:uiPriority="63" w:unhideWhenUsed="0"/>
-    <w:lsdException w:name="Medium Shading 2 Accent 1" w:semiHidden="0" w:uiPriority="64" w:unhideWhenUsed="0"/>
-    <w:lsdException w:name="Medium List 1 Accent 1" w:semiHidden="0" w:uiPriority="65" w:unhideWhenUsed="0"/>
-    <w:lsdException w:name="Revision" w:uiPriority="99" w:unhideWhenUsed="0"/>
-    <w:lsdException w:name="List Paragraph" w:semiHidden="0" w:uiPriority="34" w:unhideWhenUsed="0" w:qFormat="1"/>
-    <w:lsdException w:name="Quote" w:semiHidden="0" w:uiPriority="29" w:unhideWhenUsed="0" w:qFormat="1"/>
-    <w:lsdException w:name="Intense Quote" w:semiHidden="0" w:uiPriority="30" w:unhideWhenUsed="0" w:qFormat="1"/>
-    <w:lsdException w:name="Medium List 2 Accent 1" w:semiHidden="0" w:uiPriority="66" w:unhideWhenUsed="0"/>
-    <w:lsdException w:name="Medium Grid 1 Accent 1" w:semiHidden="0" w:uiPriority="67" w:unhideWhenUsed="0"/>
-    <w:lsdException w:name="Medium Grid 2 Accent 1" w:semiHidden="0" w:uiPriority="68" w:unhideWhenUsed="0"/>
-    <w:lsdException w:name="Medium Grid 3 Accent 1" w:semiHidden="0" w:uiPriority="69" w:unhideWhenUsed="0"/>
-    <w:lsdException w:name="Dark List Accent 1" w:semiHidden="0" w:uiPriority="70" w:unhideWhenUsed="0"/>
-    <w:lsdException w:name="Colorful Shading Accent 1" w:semiHidden="0" w:uiPriority="71" w:unhideWhenUsed="0"/>
-    <w:lsdException w:name="Colorful List Accent 1" w:semiHidden="0" w:uiPriority="72" w:unhideWhenUsed="0"/>
-    <w:lsdException w:name="Colorful Grid Accent 1" w:semiHidden="0" w:uiPriority="73" w:unhideWhenUsed="0"/>
-    <w:lsdException w:name="Light Shading Accent 2" w:semiHidden="0" w:uiPriority="60" w:unhideWhenUsed="0"/>
-    <w:lsdException w:name="Light List Accent 2" w:semiHidden="0" w:uiPriority="61" w:unhideWhenUsed="0"/>
-    <w:lsdException w:name="Light Grid Accent 2" w:semiHidden="0" w:uiPriority="62" w:unhideWhenUsed="0"/>
-    <w:lsdException w:name="Medium Shading 1 Accent 2" w:semiHidden="0" w:uiPriority="63" w:unhideWhenUsed="0"/>
-    <w:lsdException w:name="Medium Shading 2 Accent 2" w:semiHidden="0" w:uiPriority="64" w:unhideWhenUsed="0"/>
-    <w:lsdException w:name="Medium List 1 Accent 2" w:semiHidden="0" w:uiPriority="65" w:unhideWhenUsed="0"/>
-    <w:lsdException w:name="Medium List 2 Accent 2" w:semiHidden="0" w:uiPriority="66" w:unhideWhenUsed="0"/>
-    <w:lsdException w:name="Medium Grid 1 Accent 2" w:semiHidden="0" w:uiPriority="67" w:unhideWhenUsed="0"/>
-    <w:lsdException w:name="Medium Grid 2 Accent 2" w:semiHidden="0" w:uiPriority="68" w:unhideWhenUsed="0"/>
-    <w:lsdException w:name="Medium Grid 3 Accent 2" w:semiHidden="0" w:uiPriority="69" w:unhideWhenUsed="0"/>
-    <w:lsdException w:name="Dark List Accent 2" w:semiHidden="0" w:uiPriority="70" w:unhideWhenUsed="0"/>
-    <w:lsdException w:name="Colorful Shading Accent 2" w:semiHidden="0" w:uiPriority="71" w:unhideWhenUsed="0"/>
-    <w:lsdException w:name="Colorful List Accent 2" w:semiHidden="0" w:uiPriority="72" w:unhideWhenUsed="0"/>
-    <w:lsdException w:name="Colorful Grid Accent 2" w:semiHidden="0" w:uiPriority="73" w:unhideWhenUsed="0"/>
-    <w:lsdException w:name="Light Shading Accent 3" w:semiHidden="0" w:uiPriority="60" w:unhideWhenUsed="0"/>
-    <w:lsdException w:name="Light List Accent 3" w:semiHidden="0" w:uiPriority="61" w:unhideWhenUsed="0"/>
-    <w:lsdException w:name="Light Grid Accent 3" w:semiHidden="0" w:uiPriority="62" w:unhideWhenUsed="0"/>
-    <w:lsdException w:name="Medium Shading 1 Accent 3" w:semiHidden="0" w:uiPriority="63" w:unhideWhenUsed="0"/>
-    <w:lsdException w:name="Medium Shading 2 Accent 3" w:semiHidden="0" w:uiPriority="64" w:unhideWhenUsed="0"/>
-    <w:lsdException w:name="Medium List 1 Accent 3" w:semiHidden="0" w:uiPriority="65" w:unhideWhenUsed="0"/>
-    <w:lsdException w:name="Medium List 2 Accent 3" w:semiHidden="0" w:uiPriority="66" w:unhideWhenUsed="0"/>
-    <w:lsdException w:name="Medium Grid 1 Accent 3" w:semiHidden="0" w:uiPriority="67" w:unhideWhenUsed="0"/>
-    <w:lsdException w:name="Medium Grid 2 Accent 3" w:semiHidden="0" w:uiPriority="68" w:unhideWhenUsed="0"/>
-    <w:lsdException w:name="Medium Grid 3 Accent 3" w:semiHidden="0" w:uiPriority="69" w:unhideWhenUsed="0"/>
-    <w:lsdException w:name="Dark List Accent 3" w:semiHidden="0" w:uiPriority="70" w:unhideWhenUsed="0"/>
-    <w:lsdException w:name="Colorful Shading Accent 3" w:semiHidden="0" w:uiPriority="71" w:unhideWhenUsed="0"/>
-    <w:lsdException w:name="Colorful List Accent 3" w:semiHidden="0" w:uiPriority="72" w:unhideWhenUsed="0"/>
-    <w:lsdException w:name="Colorful Grid Accent 3" w:semiHidden="0" w:uiPriority="73" w:unhideWhenUsed="0"/>
-    <w:lsdException w:name="Light Shading Accent 4" w:semiHidden="0" w:uiPriority="60" w:unhideWhenUsed="0"/>
-    <w:lsdException w:name="Light List Accent 4" w:semiHidden="0" w:uiPriority="61" w:unhideWhenUsed="0"/>
-    <w:lsdException w:name="Light Grid Accent 4" w:semiHidden="0" w:uiPriority="62" w:unhideWhenUsed="0"/>
-    <w:lsdException w:name="Medium Shading 1 Accent 4" w:semiHidden="0" w:uiPriority="63" w:unhideWhenUsed="0"/>
-    <w:lsdException w:name="Medium Shading 2 Accent 4" w:semiHidden="0" w:uiPriority="64" w:unhideWhenUsed="0"/>
-    <w:lsdException w:name="Medium List 1 Accent 4" w:semiHidden="0" w:uiPriority="65" w:unhideWhenUsed="0"/>
-    <w:lsdException w:name="Medium List 2 Accent 4" w:semiHidden="0" w:uiPriority="66" w:unhideWhenUsed="0"/>
-    <w:lsdException w:name="Medium Grid 1 Accent 4" w:semiHidden="0" w:uiPriority="67" w:unhideWhenUsed="0"/>
-    <w:lsdException w:name="Medium Grid 2 Accent 4" w:semiHidden="0" w:uiPriority="68" w:unhideWhenUsed="0"/>
-    <w:lsdException w:name="Medium Grid 3 Accent 4" w:semiHidden="0" w:uiPriority="69" w:unhideWhenUsed="0"/>
-    <w:lsdException w:name="Dark List Accent 4" w:semiHidden="0" w:uiPriority="70" w:unhideWhenUsed="0"/>
-    <w:lsdException w:name="Colorful Shading Accent 4" w:semiHidden="0" w:uiPriority="71" w:unhideWhenUsed="0"/>
-    <w:lsdException w:name="Colorful List Accent 4" w:semiHidden="0" w:uiPriority="72" w:unhideWhenUsed="0"/>
-    <w:lsdException w:name="Colorful Grid Accent 4" w:semiHidden="0" w:uiPriority="73" w:unhideWhenUsed="0"/>
-    <w:lsdException w:name="Light Shading Accent 5" w:semiHidden="0" w:uiPriority="60" w:unhideWhenUsed="0"/>
-    <w:lsdException w:name="Light List Accent 5" w:semiHidden="0" w:uiPriority="61" w:unhideWhenUsed="0"/>
-    <w:lsdException w:name="Light Grid Accent 5" w:semiHidden="0" w:uiPriority="62" w:unhideWhenUsed="0"/>
-    <w:lsdException w:name="Medium Shading 1 Accent 5" w:semiHidden="0" w:uiPriority="63" w:unhideWhenUsed="0"/>
-    <w:lsdException w:name="Medium Shading 2 Accent 5" w:semiHidden="0" w:uiPriority="64" w:unhideWhenUsed="0"/>
-    <w:lsdException w:name="Medium List 1 Accent 5" w:semiHidden="0" w:uiPriority="65" w:unhideWhenUsed="0"/>
-    <w:lsdException w:name="Medium List 2 Accent 5" w:semiHidden="0" w:uiPriority="66" w:unhideWhenUsed="0"/>
-    <w:lsdException w:name="Medium Grid 1 Accent 5" w:semiHidden="0" w:uiPriority="67" w:unhideWhenUsed="0"/>
-    <w:lsdException w:name="Medium Grid 2 Accent 5" w:semiHidden="0" w:uiPriority="68" w:unhideWhenUsed="0"/>
-    <w:lsdException w:name="Medium Grid 3 Accent 5" w:semiHidden="0" w:uiPriority="69" w:unhideWhenUsed="0"/>
-    <w:lsdException w:name="Dark List Accent 5" w:semiHidden="0" w:uiPriority="70" w:unhideWhenUsed="0"/>
-    <w:lsdException w:name="Colorful Shading Accent 5" w:semiHidden="0" w:uiPriority="71" w:unhideWhenUsed="0"/>
-    <w:lsdException w:name="Colorful List Accent 5" w:semiHidden="0" w:uiPriority="72" w:unhideWhenUsed="0"/>
-    <w:lsdException w:name="Colorful Grid Accent 5" w:semiHidden="0" w:uiPriority="73" w:unhideWhenUsed="0"/>
-    <w:lsdException w:name="Light Shading Accent 6" w:semiHidden="0" w:uiPriority="60" w:unhideWhenUsed="0"/>
-    <w:lsdException w:name="Light List Accent 6" w:semiHidden="0" w:uiPriority="61" w:unhideWhenUsed="0"/>
-    <w:lsdException w:name="Light Grid Accent 6" w:semiHidden="0" w:uiPriority="62" w:unhideWhenUsed="0"/>
-    <w:lsdException w:name="Medium Shading 1 Accent 6" w:semiHidden="0" w:uiPriority="63" w:unhideWhenUsed="0"/>
-    <w:lsdException w:name="Medium Shading 2 Accent 6" w:semiHidden="0" w:uiPriority="64" w:unhideWhenUsed="0"/>
-    <w:lsdException w:name="Medium List 1 Accent 6" w:semiHidden="0" w:uiPriority="65" w:unhideWhenUsed="0"/>
-    <w:lsdException w:name="Medium List 2 Accent 6" w:semiHidden="0" w:uiPriority="66" w:unhideWhenUsed="0"/>
-    <w:lsdException w:name="Medium Grid 1 Accent 6" w:semiHidden="0" w:uiPriority="67" w:unhideWhenUsed="0"/>
-    <w:lsdException w:name="Medium Grid 2 Accent 6" w:semiHidden="0" w:uiPriority="68" w:unhideWhenUsed="0"/>
-    <w:lsdException w:name="Medium Grid 3 Accent 6" w:semiHidden="0" w:uiPriority="69" w:unhideWhenUsed="0"/>
-    <w:lsdException w:name="Dark List Accent 6" w:semiHidden="0" w:uiPriority="70" w:unhideWhenUsed="0"/>
-    <w:lsdException w:name="Colorful Shading Accent 6" w:semiHidden="0" w:uiPriority="71" w:unhideWhenUsed="0"/>
-    <w:lsdException w:name="Colorful List Accent 6" w:semiHidden="0" w:uiPriority="72" w:unhideWhenUsed="0"/>
-    <w:lsdException w:name="Colorful Grid Accent 6" w:semiHidden="0" w:uiPriority="73" w:unhideWhenUsed="0"/>
-    <w:lsdException w:name="Subtle Emphasis" w:semiHidden="0" w:uiPriority="19" w:unhideWhenUsed="0" w:qFormat="1"/>
-    <w:lsdException w:name="Intense Emphasis" w:semiHidden="0" w:uiPriority="21" w:unhideWhenUsed="0" w:qFormat="1"/>
-    <w:lsdException w:name="Subtle Reference" w:semiHidden="0" w:uiPriority="31" w:unhideWhenUsed="0" w:qFormat="1"/>
-    <w:lsdException w:name="Intense Reference" w:semiHidden="0" w:uiPriority="32" w:unhideWhenUsed="0" w:qFormat="1"/>
-    <w:lsdException w:name="Book Title" w:semiHidden="0" w:uiPriority="33" w:unhideWhenUsed="0" w:qFormat="1"/>
-    <w:lsdException w:name="Bibliography" w:uiPriority="37"/>
-    <w:lsdException w:name="TOC Heading" w:uiPriority="39" w:qFormat="1"/>
+  <w:latentStyles w:defLockedState="0" w:defUIPriority="0" w:defSemiHidden="0" w:defUnhideWhenUsed="0" w:defQFormat="0" w:count="377">
+    <w:lsdException w:name="Normal" w:qFormat="1"/>
+    <w:lsdException w:name="heading 1" w:qFormat="1"/>
+    <w:lsdException w:name="heading 2" w:semiHidden="1" w:unhideWhenUsed="1" w:qFormat="1"/>
+    <w:lsdException w:name="heading 3" w:semiHidden="1" w:unhideWhenUsed="1" w:qFormat="1"/>
+    <w:lsdException w:name="heading 4" w:semiHidden="1" w:unhideWhenUsed="1" w:qFormat="1"/>
+    <w:lsdException w:name="heading 5" w:semiHidden="1" w:unhideWhenUsed="1" w:qFormat="1"/>
+    <w:lsdException w:name="heading 6" w:semiHidden="1" w:unhideWhenUsed="1" w:qFormat="1"/>
+    <w:lsdException w:name="heading 7" w:semiHidden="1" w:unhideWhenUsed="1" w:qFormat="1"/>
+    <w:lsdException w:name="heading 8" w:semiHidden="1" w:unhideWhenUsed="1" w:qFormat="1"/>
+    <w:lsdException w:name="heading 9" w:semiHidden="1" w:unhideWhenUsed="1" w:qFormat="1"/>
+    <w:lsdException w:name="index 1" w:semiHidden="1" w:unhideWhenUsed="1"/>
+    <w:lsdException w:name="index 2" w:semiHidden="1" w:unhideWhenUsed="1"/>
+    <w:lsdException w:name="index 3" w:semiHidden="1" w:unhideWhenUsed="1"/>
+    <w:lsdException w:name="index 4" w:semiHidden="1" w:unhideWhenUsed="1"/>
+    <w:lsdException w:name="index 5" w:semiHidden="1" w:unhideWhenUsed="1"/>
+    <w:lsdException w:name="index 6" w:semiHidden="1" w:unhideWhenUsed="1"/>
+    <w:lsdException w:name="index 7" w:semiHidden="1" w:unhideWhenUsed="1"/>
+    <w:lsdException w:name="index 8" w:semiHidden="1" w:unhideWhenUsed="1"/>
+    <w:lsdException w:name="index 9" w:semiHidden="1" w:unhideWhenUsed="1"/>
+    <w:lsdException w:name="toc 1" w:semiHidden="1" w:unhideWhenUsed="1"/>
+    <w:lsdException w:name="toc 2" w:semiHidden="1" w:unhideWhenUsed="1"/>
+    <w:lsdException w:name="toc 3" w:semiHidden="1" w:unhideWhenUsed="1"/>
+    <w:lsdException w:name="toc 4" w:semiHidden="1" w:unhideWhenUsed="1"/>
+    <w:lsdException w:name="toc 5" w:semiHidden="1" w:unhideWhenUsed="1"/>
+    <w:lsdException w:name="toc 6" w:semiHidden="1" w:unhideWhenUsed="1"/>
+    <w:lsdException w:name="toc 7" w:semiHidden="1" w:unhideWhenUsed="1"/>
+    <w:lsdException w:name="toc 8" w:semiHidden="1" w:unhideWhenUsed="1"/>
+    <w:lsdException w:name="toc 9" w:semiHidden="1" w:unhideWhenUsed="1"/>
+    <w:lsdException w:name="Normal Indent" w:semiHidden="1" w:unhideWhenUsed="1"/>
+    <w:lsdException w:name="footnote text" w:semiHidden="1" w:unhideWhenUsed="1"/>
+    <w:lsdException w:name="annotation text" w:semiHidden="1" w:unhideWhenUsed="1"/>
+    <w:lsdException w:name="header" w:semiHidden="1" w:unhideWhenUsed="1"/>
+    <w:lsdException w:name="footer" w:semiHidden="1" w:unhideWhenUsed="1"/>
+    <w:lsdException w:name="index heading" w:semiHidden="1" w:unhideWhenUsed="1"/>
+    <w:lsdException w:name="caption" w:semiHidden="1" w:unhideWhenUsed="1" w:qFormat="1"/>
+    <w:lsdException w:name="table of figures" w:semiHidden="1" w:unhideWhenUsed="1"/>
+    <w:lsdException w:name="envelope address" w:semiHidden="1" w:unhideWhenUsed="1"/>
+    <w:lsdException w:name="envelope return" w:semiHidden="1" w:unhideWhenUsed="1"/>
+    <w:lsdException w:name="footnote reference" w:semiHidden="1" w:unhideWhenUsed="1"/>
+    <w:lsdException w:name="annotation reference" w:semiHidden="1" w:unhideWhenUsed="1"/>
+    <w:lsdException w:name="line number" w:semiHidden="1" w:unhideWhenUsed="1"/>
+    <w:lsdException w:name="page number" w:semiHidden="1" w:unhideWhenUsed="1"/>
+    <w:lsdException w:name="endnote reference" w:semiHidden="1" w:unhideWhenUsed="1"/>
+    <w:lsdException w:name="table of authorities" w:semiHidden="1" w:unhideWhenUsed="1"/>
+    <w:lsdException w:name="macro" w:semiHidden="1" w:unhideWhenUsed="1"/>
+    <w:lsdException w:name="List Bullet" w:semiHidden="1" w:unhideWhenUsed="1"/>
+    <w:lsdException w:name="List Number" w:semiHidden="1" w:unhideWhenUsed="1"/>
+    <w:lsdException w:name="List 2" w:semiHidden="1" w:unhideWhenUsed="1"/>
+    <w:lsdException w:name="List 3" w:semiHidden="1" w:unhideWhenUsed="1"/>
+    <w:lsdException w:name="List 4" w:semiHidden="1" w:unhideWhenUsed="1"/>
+    <w:lsdException w:name="List 5" w:semiHidden="1" w:unhideWhenUsed="1"/>
+    <w:lsdException w:name="List Bullet 2" w:semiHidden="1" w:unhideWhenUsed="1"/>
+    <w:lsdException w:name="List Bullet 3" w:semiHidden="1" w:unhideWhenUsed="1"/>
+    <w:lsdException w:name="List Bullet 4" w:semiHidden="1" w:unhideWhenUsed="1"/>
+    <w:lsdException w:name="List Bullet 5" w:semiHidden="1" w:unhideWhenUsed="1"/>
+    <w:lsdException w:name="List Number 2" w:semiHidden="1" w:unhideWhenUsed="1"/>
+    <w:lsdException w:name="List Number 3" w:semiHidden="1" w:unhideWhenUsed="1"/>
+    <w:lsdException w:name="List Number 4" w:semiHidden="1" w:unhideWhenUsed="1"/>
+    <w:lsdException w:name="List Number 5" w:semiHidden="1" w:unhideWhenUsed="1"/>
+    <w:lsdException w:name="Title" w:qFormat="1"/>
+    <w:lsdException w:name="Closing" w:semiHidden="1" w:unhideWhenUsed="1"/>
+    <w:lsdException w:name="Signature" w:semiHidden="1" w:unhideWhenUsed="1"/>
+    <w:lsdException w:name="Default Paragraph Font" w:semiHidden="1" w:unhideWhenUsed="1"/>
+    <w:lsdException w:name="Body Text" w:semiHidden="1" w:unhideWhenUsed="1"/>
+    <w:lsdException w:name="Body Text Indent" w:semiHidden="1" w:unhideWhenUsed="1"/>
+    <w:lsdException w:name="List Continue 5" w:semiHidden="1" w:unhideWhenUsed="1"/>
+    <w:lsdException w:name="Message Header" w:semiHidden="1" w:unhideWhenUsed="1"/>
+    <w:lsdException w:name="Subtitle" w:qFormat="1"/>
+    <w:lsdException w:name="Salutation" w:semiHidden="1" w:unhideWhenUsed="1"/>
+    <w:lsdException w:name="Date" w:semiHidden="1" w:unhideWhenUsed="1"/>
+    <w:lsdException w:name="Body Text First Indent" w:semiHidden="1" w:unhideWhenUsed="1"/>
+    <w:lsdException w:name="Body Text First Indent 2" w:semiHidden="1" w:unhideWhenUsed="1"/>
+    <w:lsdException w:name="Note Heading" w:semiHidden="1" w:unhideWhenUsed="1"/>
+    <w:lsdException w:name="Body Text 2" w:semiHidden="1" w:unhideWhenUsed="1"/>
+    <w:lsdException w:name="Body Text 3" w:semiHidden="1" w:unhideWhenUsed="1"/>
+    <w:lsdException w:name="Body Text Indent 2" w:semiHidden="1" w:unhideWhenUsed="1"/>
+    <w:lsdException w:name="Body Text Indent 3" w:semiHidden="1" w:unhideWhenUsed="1"/>
+    <w:lsdException w:name="Block Text" w:semiHidden="1" w:unhideWhenUsed="1"/>
+    <w:lsdException w:name="Hyperlink" w:semiHidden="1" w:unhideWhenUsed="1"/>
+    <w:lsdException w:name="FollowedHyperlink" w:semiHidden="1" w:unhideWhenUsed="1"/>
+    <w:lsdException w:name="Strong" w:qFormat="1"/>
+    <w:lsdException w:name="Emphasis" w:qFormat="1"/>
+    <w:lsdException w:name="Document Map" w:semiHidden="1" w:unhideWhenUsed="1"/>
+    <w:lsdException w:name="Plain Text" w:semiHidden="1" w:unhideWhenUsed="1"/>
+    <w:lsdException w:name="E-mail Signature" w:semiHidden="1" w:unhideWhenUsed="1"/>
+    <w:lsdException w:name="HTML Top of Form" w:semiHidden="1" w:unhideWhenUsed="1"/>
+    <w:lsdException w:name="HTML Bottom of Form" w:semiHidden="1" w:unhideWhenUsed="1"/>
+    <w:lsdException w:name="Normal (Web)" w:semiHidden="1" w:unhideWhenUsed="1"/>
+    <w:lsdException w:name="HTML Acronym" w:semiHidden="1" w:unhideWhenUsed="1"/>
+    <w:lsdException w:name="HTML Address" w:semiHidden="1" w:unhideWhenUsed="1"/>
+    <w:lsdException w:name="HTML Cite" w:semiHidden="1" w:unhideWhenUsed="1"/>
+    <w:lsdException w:name="HTML Code" w:semiHidden="1" w:unhideWhenUsed="1"/>
+    <w:lsdException w:name="HTML Definition" w:semiHidden="1" w:unhideWhenUsed="1"/>
+    <w:lsdException w:name="HTML Keyboard" w:semiHidden="1" w:unhideWhenUsed="1"/>
+    <w:lsdException w:name="HTML Preformatted" w:semiHidden="1" w:unhideWhenUsed="1"/>
+    <w:lsdException w:name="HTML Sample" w:semiHidden="1" w:unhideWhenUsed="1"/>
+    <w:lsdException w:name="HTML Typewriter" w:semiHidden="1" w:unhideWhenUsed="1"/>
+    <w:lsdException w:name="HTML Variable" w:semiHidden="1" w:unhideWhenUsed="1"/>
+    <w:lsdException w:name="Normal Table" w:semiHidden="1" w:unhideWhenUsed="1"/>
+    <w:lsdException w:name="annotation subject" w:semiHidden="1" w:unhideWhenUsed="1"/>
+    <w:lsdException w:name="No List" w:semiHidden="1" w:unhideWhenUsed="1"/>
+    <w:lsdException w:name="Outline List 1" w:semiHidden="1" w:unhideWhenUsed="1"/>
+    <w:lsdException w:name="Outline List 2" w:semiHidden="1" w:unhideWhenUsed="1"/>
+    <w:lsdException w:name="Outline List 3" w:semiHidden="1" w:unhideWhenUsed="1"/>
+    <w:lsdException w:name="Table Simple 1" w:semiHidden="1" w:unhideWhenUsed="1"/>
+    <w:lsdException w:name="Table Simple 2" w:semiHidden="1" w:unhideWhenUsed="1"/>
+    <w:lsdException w:name="Table Simple 3" w:semiHidden="1" w:unhideWhenUsed="1"/>
+    <w:lsdException w:name="Table Classic 1" w:semiHidden="1" w:unhideWhenUsed="1"/>
+    <w:lsdException w:name="Table Classic 2" w:semiHidden="1" w:unhideWhenUsed="1"/>
+    <w:lsdException w:name="Table Classic 3" w:semiHidden="1" w:unhideWhenUsed="1"/>
+    <w:lsdException w:name="Table Classic 4" w:semiHidden="1" w:unhideWhenUsed="1"/>
+    <w:lsdException w:name="Table Colorful 1" w:semiHidden="1" w:unhideWhenUsed="1"/>
+    <w:lsdException w:name="Table Colorful 2" w:semiHidden="1" w:unhideWhenUsed="1"/>
+    <w:lsdException w:name="Table Colorful 3" w:semiHidden="1" w:unhideWhenUsed="1"/>
+    <w:lsdException w:name="Table Columns 1" w:semiHidden="1" w:unhideWhenUsed="1"/>
+    <w:lsdException w:name="Table Columns 2" w:semiHidden="1" w:unhideWhenUsed="1"/>
+    <w:lsdException w:name="Table Columns 3" w:semiHidden="1" w:unhideWhenUsed="1"/>
+    <w:lsdException w:name="Table Columns 4" w:semiHidden="1" w:unhideWhenUsed="1"/>
+    <w:lsdException w:name="Table Columns 5" w:semiHidden="1" w:unhideWhenUsed="1"/>
+    <w:lsdException w:name="Table Grid 1" w:semiHidden="1" w:unhideWhenUsed="1"/>
+    <w:lsdException w:name="Table Grid 2" w:semiHidden="1" w:unhideWhenUsed="1"/>
+    <w:lsdException w:name="Table Grid 3" w:semiHidden="1" w:unhideWhenUsed="1"/>
+    <w:lsdException w:name="Table Grid 4" w:semiHidden="1" w:unhideWhenUsed="1"/>
+    <w:lsdException w:name="Table Grid 5" w:semiHidden="1" w:unhideWhenUsed="1"/>
+    <w:lsdException w:name="Table Grid 6" w:semiHidden="1" w:unhideWhenUsed="1"/>
+    <w:lsdException w:name="Table Grid 7" w:semiHidden="1" w:unhideWhenUsed="1"/>
+    <w:lsdException w:name="Table Grid 8" w:semiHidden="1" w:unhideWhenUsed="1"/>
+    <w:lsdException w:name="Table List 1" w:semiHidden="1" w:unhideWhenUsed="1"/>
+    <w:lsdException w:name="Table List 2" w:semiHidden="1" w:unhideWhenUsed="1"/>
+    <w:lsdException w:name="Table List 3" w:semiHidden="1" w:unhideWhenUsed="1"/>
+    <w:lsdException w:name="Table List 4" w:semiHidden="1" w:unhideWhenUsed="1"/>
+    <w:lsdException w:name="Table List 5" w:semiHidden="1" w:unhideWhenUsed="1"/>
+    <w:lsdException w:name="Table List 6" w:semiHidden="1" w:unhideWhenUsed="1"/>
+    <w:lsdException w:name="Table List 7" w:semiHidden="1" w:unhideWhenUsed="1"/>
+    <w:lsdException w:name="Table List 8" w:semiHidden="1" w:unhideWhenUsed="1"/>
+    <w:lsdException w:name="Table 3D effects 1" w:semiHidden="1" w:unhideWhenUsed="1"/>
+    <w:lsdException w:name="Table 3D effects 2" w:semiHidden="1" w:unhideWhenUsed="1"/>
+    <w:lsdException w:name="Table 3D effects 3" w:semiHidden="1" w:unhideWhenUsed="1"/>
+    <w:lsdException w:name="Table Contemporary" w:semiHidden="1" w:unhideWhenUsed="1"/>
+    <w:lsdException w:name="Table Elegant" w:semiHidden="1" w:unhideWhenUsed="1"/>
+    <w:lsdException w:name="Table Professional" w:semiHidden="1" w:unhideWhenUsed="1"/>
+    <w:lsdException w:name="Table Subtle 1" w:semiHidden="1" w:unhideWhenUsed="1"/>
+    <w:lsdException w:name="Table Subtle 2" w:semiHidden="1" w:unhideWhenUsed="1"/>
+    <w:lsdException w:name="Table Web 1" w:semiHidden="1" w:unhideWhenUsed="1"/>
+    <w:lsdException w:name="Table Web 2" w:semiHidden="1" w:unhideWhenUsed="1"/>
+    <w:lsdException w:name="Table Web 3" w:semiHidden="1" w:unhideWhenUsed="1"/>
+    <w:lsdException w:name="Table Grid" w:semiHidden="1" w:unhideWhenUsed="1"/>
+    <w:lsdException w:name="Table Theme" w:semiHidden="1" w:unhideWhenUsed="1"/>
+    <w:lsdException w:name="Placeholder Text" w:semiHidden="1" w:uiPriority="99"/>
+    <w:lsdException w:name="No Spacing" w:uiPriority="1" w:qFormat="1"/>
+    <w:lsdException w:name="Light Shading" w:uiPriority="60"/>
+    <w:lsdException w:name="Light List" w:uiPriority="61"/>
+    <w:lsdException w:name="Light Grid" w:uiPriority="62"/>
+    <w:lsdException w:name="Medium Shading 1" w:uiPriority="63"/>
+    <w:lsdException w:name="Medium Shading 2" w:uiPriority="64"/>
+    <w:lsdException w:name="Medium List 1" w:uiPriority="65"/>
+    <w:lsdException w:name="Medium List 2" w:uiPriority="66"/>
+    <w:lsdException w:name="Medium Grid 1" w:uiPriority="67"/>
+    <w:lsdException w:name="Medium Grid 2" w:uiPriority="68"/>
+    <w:lsdException w:name="Medium Grid 3" w:uiPriority="69"/>
+    <w:lsdException w:name="Dark List" w:uiPriority="70"/>
+    <w:lsdException w:name="Colorful Shading" w:uiPriority="71"/>
+    <w:lsdException w:name="Colorful List" w:uiPriority="72"/>
+    <w:lsdException w:name="Colorful Grid" w:uiPriority="73"/>
+    <w:lsdException w:name="Light Shading Accent 1" w:uiPriority="60"/>
+    <w:lsdException w:name="Light List Accent 1" w:uiPriority="61"/>
+    <w:lsdException w:name="Light Grid Accent 1" w:uiPriority="62"/>
+    <w:lsdException w:name="Medium Shading 1 Accent 1" w:uiPriority="63"/>
+    <w:lsdException w:name="Medium Shading 2 Accent 1" w:uiPriority="64"/>
+    <w:lsdException w:name="Medium List 1 Accent 1" w:uiPriority="65"/>
+    <w:lsdException w:name="Revision" w:semiHidden="1" w:uiPriority="99"/>
+    <w:lsdException w:name="List Paragraph" w:uiPriority="34" w:qFormat="1"/>
+    <w:lsdException w:name="Quote" w:uiPriority="29" w:qFormat="1"/>
+    <w:lsdException w:name="Intense Quote" w:uiPriority="30" w:qFormat="1"/>
+    <w:lsdException w:name="Medium List 2 Accent 1" w:uiPriority="66"/>
+    <w:lsdException w:name="Medium Grid 1 Accent 1" w:uiPriority="67"/>
+    <w:lsdException w:name="Medium Grid 2 Accent 1" w:uiPriority="68"/>
+    <w:lsdException w:name="Medium Grid 3 Accent 1" w:uiPriority="69"/>
+    <w:lsdException w:name="Dark List Accent 1" w:uiPriority="70"/>
+    <w:lsdException w:name="Colorful Shading Accent 1" w:uiPriority="71"/>
+    <w:lsdException w:name="Colorful List Accent 1" w:uiPriority="72"/>
+    <w:lsdException w:name="Colorful Grid Accent 1" w:uiPriority="73"/>
+    <w:lsdException w:name="Light Shading Accent 2" w:uiPriority="60"/>
+    <w:lsdException w:name="Light List Accent 2" w:uiPriority="61"/>
+    <w:lsdException w:name="Light Grid Accent 2" w:uiPriority="62"/>
+    <w:lsdException w:name="Medium Shading 1 Accent 2" w:uiPriority="63"/>
+    <w:lsdException w:name="Medium Shading 2 Accent 2" w:uiPriority="64"/>
+    <w:lsdException w:name="Medium List 1 Accent 2" w:uiPriority="65"/>
+    <w:lsdException w:name="Medium List 2 Accent 2" w:uiPriority="66"/>
+    <w:lsdException w:name="Medium Grid 1 Accent 2" w:uiPriority="67"/>
+    <w:lsdException w:name="Medium Grid 2 Accent 2" w:uiPriority="68"/>
+    <w:lsdException w:name="Medium Grid 3 Accent 2" w:uiPriority="69"/>
+    <w:lsdException w:name="Dark List Accent 2" w:uiPriority="70"/>
+    <w:lsdException w:name="Colorful Shading Accent 2" w:uiPriority="71"/>
+    <w:lsdException w:name="Colorful List Accent 2" w:uiPriority="72"/>
+    <w:lsdException w:name="Colorful Grid Accent 2" w:uiPriority="73"/>
+    <w:lsdException w:name="Light Shading Accent 3" w:uiPriority="60"/>
+    <w:lsdException w:name="Light List Accent 3" w:uiPriority="61"/>
+    <w:lsdException w:name="Light Grid Accent 3" w:uiPriority="62"/>
+    <w:lsdException w:name="Medium Shading 1 Accent 3" w:uiPriority="63"/>
+    <w:lsdException w:name="Medium Shading 2 Accent 3" w:uiPriority="64"/>
+    <w:lsdException w:name="Medium List 1 Accent 3" w:uiPriority="65"/>
+    <w:lsdException w:name="Medium List 2 Accent 3" w:uiPriority="66"/>
+    <w:lsdException w:name="Medium Grid 1 Accent 3" w:uiPriority="67"/>
+    <w:lsdException w:name="Medium Grid 2 Accent 3" w:uiPriority="68"/>
+    <w:lsdException w:name="Medium Grid 3 Accent 3" w:uiPriority="69"/>
+    <w:lsdException w:name="Dark List Accent 3" w:uiPriority="70"/>
+    <w:lsdException w:name="Colorful Shading Accent 3" w:uiPriority="71"/>
+    <w:lsdException w:name="Colorful List Accent 3" w:uiPriority="72"/>
+    <w:lsdException w:name="Colorful Grid Accent 3" w:uiPriority="73"/>
+    <w:lsdException w:name="Light Shading Accent 4" w:uiPriority="60"/>
+    <w:lsdException w:name="Light List Accent 4" w:uiPriority="61"/>
+    <w:lsdException w:name="Light Grid Accent 4" w:uiPriority="62"/>
+    <w:lsdException w:name="Medium Shading 1 Accent 4" w:uiPriority="63"/>
+    <w:lsdException w:name="Medium Shading 2 Accent 4" w:uiPriority="64"/>
+    <w:lsdException w:name="Medium List 1 Accent 4" w:uiPriority="65"/>
+    <w:lsdException w:name="Medium List 2 Accent 4" w:uiPriority="66"/>
+    <w:lsdException w:name="Medium Grid 1 Accent 4" w:uiPriority="67"/>
+    <w:lsdException w:name="Medium Grid 2 Accent 4" w:uiPriority="68"/>
+    <w:lsdException w:name="Medium Grid 3 Accent 4" w:uiPriority="69"/>
+    <w:lsdException w:name="Dark List Accent 4" w:uiPriority="70"/>
+    <w:lsdException w:name="Colorful Shading Accent 4" w:uiPriority="71"/>
+    <w:lsdException w:name="Colorful List Accent 4" w:uiPriority="72"/>
+    <w:lsdException w:name="Colorful Grid Accent 4" w:uiPriority="73"/>
+    <w:lsdException w:name="Light Shading Accent 5" w:uiPriority="60"/>
+    <w:lsdException w:name="Light List Accent 5" w:uiPriority="61"/>
+    <w:lsdException w:name="Light Grid Accent 5" w:uiPriority="62"/>
+    <w:lsdException w:name="Medium Shading 1 Accent 5" w:uiPriority="63"/>
+    <w:lsdException w:name="Medium Shading 2 Accent 5" w:uiPriority="64"/>
+    <w:lsdException w:name="Medium List 1 Accent 5" w:uiPriority="65"/>
+    <w:lsdException w:name="Medium List 2 Accent 5" w:uiPriority="66"/>
+    <w:lsdException w:name="Medium Grid 1 Accent 5" w:uiPriority="67"/>
+    <w:lsdException w:name="Medium Grid 2 Accent 5" w:uiPriority="68"/>
+    <w:lsdException w:name="Medium Grid 3 Accent 5" w:uiPriority="69"/>
+    <w:lsdException w:name="Dark List Accent 5" w:uiPriority="70"/>
+    <w:lsdException w:name="Colorful Shading Accent 5" w:uiPriority="71"/>
+    <w:lsdException w:name="Colorful List Accent 5" w:uiPriority="72"/>
+    <w:lsdException w:name="Colorful Grid Accent 5" w:uiPriority="73"/>
+    <w:lsdException w:name="Light Shading Accent 6" w:uiPriority="60"/>
+    <w:lsdException w:name="Light List Accent 6" w:uiPriority="61"/>
+    <w:lsdException w:name="Light Grid Accent 6" w:uiPriority="62"/>
+    <w:lsdException w:name="Medium Shading 1 Accent 6" w:uiPriority="63"/>
+    <w:lsdException w:name="Medium Shading 2 Accent 6" w:uiPriority="64"/>
+    <w:lsdException w:name="Medium List 1 Accent 6" w:uiPriority="65"/>
+    <w:lsdException w:name="Medium List 2 Accent 6" w:uiPriority="66"/>
+    <w:lsdException w:name="Medium Grid 1 Accent 6" w:uiPriority="67"/>
+    <w:lsdException w:name="Medium Grid 2 Accent 6" w:uiPriority="68"/>
+    <w:lsdException w:name="Medium Grid 3 Accent 6" w:uiPriority="69"/>
+    <w:lsdException w:name="Dark List Accent 6" w:uiPriority="70"/>
+    <w:lsdException w:name="Colorful Shading Accent 6" w:uiPriority="71"/>
+    <w:lsdException w:name="Colorful List Accent 6" w:uiPriority="72"/>
+    <w:lsdException w:name="Colorful Grid Accent 6" w:uiPriority="73"/>
+    <w:lsdException w:name="Subtle Emphasis" w:uiPriority="19" w:qFormat="1"/>
+    <w:lsdException w:name="Intense Emphasis" w:uiPriority="21" w:qFormat="1"/>
+    <w:lsdException w:name="Subtle Reference" w:uiPriority="31" w:qFormat="1"/>
+    <w:lsdException w:name="Intense Reference" w:uiPriority="32" w:qFormat="1"/>
+    <w:lsdException w:name="Book Title" w:uiPriority="33" w:qFormat="1"/>
+    <w:lsdException w:name="Bibliography" w:semiHidden="1" w:uiPriority="37" w:unhideWhenUsed="1"/>
+    <w:lsdException w:name="TOC Heading" w:semiHidden="1" w:uiPriority="39" w:unhideWhenUsed="1" w:qFormat="1"/>
+    <w:lsdException w:name="Plain Table 1" w:uiPriority="41"/>
+    <w:lsdException w:name="Plain Table 2" w:uiPriority="42"/>
+    <w:lsdException w:name="Plain Table 3" w:uiPriority="43"/>
+    <w:lsdException w:name="Plain Table 4" w:uiPriority="44"/>
+    <w:lsdException w:name="Plain Table 5" w:uiPriority="45"/>
+    <w:lsdException w:name="Grid Table Light" w:uiPriority="40"/>
+    <w:lsdException w:name="Grid Table 1 Light" w:uiPriority="46"/>
+    <w:lsdException w:name="Grid Table 2" w:uiPriority="47"/>
+    <w:lsdException w:name="Grid Table 3" w:uiPriority="48"/>
+    <w:lsdException w:name="Grid Table 4" w:uiPriority="49"/>
+    <w:lsdException w:name="Grid Table 5 Dark" w:uiPriority="50"/>
+    <w:lsdException w:name="Grid Table 6 Colorful" w:uiPriority="51"/>
+    <w:lsdException w:name="Grid Table 7 Colorful" w:uiPriority="52"/>
+    <w:lsdException w:name="Grid Table 1 Light Accent 1" w:uiPriority="46"/>
+    <w:lsdException w:name="Grid Table 2 Accent 1" w:uiPriority="47"/>
+    <w:lsdException w:name="Grid Table 3 Accent 1" w:uiPriority="48"/>
+    <w:lsdException w:name="Grid Table 4 Accent 1" w:uiPriority="49"/>
+    <w:lsdException w:name="Grid Table 5 Dark Accent 1" w:uiPriority="50"/>
+    <w:lsdException w:name="Grid Table 6 Colorful Accent 1" w:uiPriority="51"/>
+    <w:lsdException w:name="Grid Table 7 Colorful Accent 1" w:uiPriority="52"/>
+    <w:lsdException w:name="Grid Table 1 Light Accent 2" w:uiPriority="46"/>
+    <w:lsdException w:name="Grid Table 2 Accent 2" w:uiPriority="47"/>
+    <w:lsdException w:name="Grid Table 3 Accent 2" w:uiPriority="48"/>
+    <w:lsdException w:name="Grid Table 4 Accent 2" w:uiPriority="49"/>
+    <w:lsdException w:name="Grid Table 5 Dark Accent 2" w:uiPriority="50"/>
+    <w:lsdException w:name="Grid Table 6 Colorful Accent 2" w:uiPriority="51"/>
+    <w:lsdException w:name="Grid Table 7 Colorful Accent 2" w:uiPriority="52"/>
+    <w:lsdException w:name="Grid Table 1 Light Accent 3" w:uiPriority="46"/>
+    <w:lsdException w:name="Grid Table 2 Accent 3" w:uiPriority="47"/>
+    <w:lsdException w:name="Grid Table 3 Accent 3" w:uiPriority="48"/>
+    <w:lsdException w:name="Grid Table 4 Accent 3" w:uiPriority="49"/>
+    <w:lsdException w:name="Grid Table 5 Dark Accent 3" w:uiPriority="50"/>
+    <w:lsdException w:name="Grid Table 6 Colorful Accent 3" w:uiPriority="51"/>
+    <w:lsdException w:name="Grid Table 7 Colorful Accent 3" w:uiPriority="52"/>
+    <w:lsdException w:name="Grid Table 1 Light Accent 4" w:uiPriority="46"/>
+    <w:lsdException w:name="Grid Table 2 Accent 4" w:uiPriority="47"/>
+    <w:lsdException w:name="Grid Table 3 Accent 4" w:uiPriority="48"/>
+    <w:lsdException w:name="Grid Table 4 Accent 4" w:uiPriority="49"/>
+    <w:lsdException w:name="Grid Table 5 Dark Accent 4" w:uiPriority="50"/>
+    <w:lsdException w:name="Grid Table 6 Colorful Accent 4" w:uiPriority="51"/>
+    <w:lsdException w:name="Grid Table 7 Colorful Accent 4" w:uiPriority="52"/>
+    <w:lsdException w:name="Grid Table 1 Light Accent 5" w:uiPriority="46"/>
+    <w:lsdException w:name="Grid Table 2 Accent 5" w:uiPriority="47"/>
+    <w:lsdException w:name="Grid Table 3 Accent 5" w:uiPriority="48"/>
+    <w:lsdException w:name="Grid Table 4 Accent 5" w:uiPriority="49"/>
+    <w:lsdException w:name="Grid Table 5 Dark Accent 5" w:uiPriority="50"/>
+    <w:lsdException w:name="Grid Table 6 Colorful Accent 5" w:uiPriority="51"/>
+    <w:lsdException w:name="Grid Table 7 Colorful Accent 5" w:uiPriority="52"/>
+    <w:lsdException w:name="Grid Table 1 Light Accent 6" w:uiPriority="46"/>
+    <w:lsdException w:name="Grid Table 2 Accent 6" w:uiPriority="47"/>
+    <w:lsdException w:name="Grid Table 3 Accent 6" w:uiPriority="48"/>
+    <w:lsdException w:name="Grid Table 4 Accent 6" w:uiPriority="49"/>
+    <w:lsdException w:name="Grid Table 5 Dark Accent 6" w:uiPriority="50"/>
+    <w:lsdException w:name="Grid Table 6 Colorful Accent 6" w:uiPriority="51"/>
+    <w:lsdException w:name="Grid Table 7 Colorful Accent 6" w:uiPriority="52"/>
+    <w:lsdException w:name="List Table 1 Light" w:uiPriority="46"/>
+    <w:lsdException w:name="List Table 2" w:uiPriority="47"/>
+    <w:lsdException w:name="List Table 3" w:uiPriority="48"/>
+    <w:lsdException w:name="List Table 4" w:uiPriority="49"/>
+    <w:lsdException w:name="List Table 5 Dark" w:uiPriority="50"/>
+    <w:lsdException w:name="List Table 6 Colorful" w:uiPriority="51"/>
+    <w:lsdException w:name="List Table 7 Colorful" w:uiPriority="52"/>
+    <w:lsdException w:name="List Table 1 Light Accent 1" w:uiPriority="46"/>
+    <w:lsdException w:name="List Table 2 Accent 1" w:uiPriority="47"/>
+    <w:lsdException w:name="List Table 3 Accent 1" w:uiPriority="48"/>
+    <w:lsdException w:name="List Table 4 Accent 1" w:uiPriority="49"/>
+    <w:lsdException w:name="List Table 5 Dark Accent 1" w:uiPriority="50"/>
+    <w:lsdException w:name="List Table 6 Colorful Accent 1" w:uiPriority="51"/>
+    <w:lsdException w:name="List Table 7 Colorful Accent 1" w:uiPriority="52"/>
+    <w:lsdException w:name="List Table 1 Light Accent 2" w:uiPriority="46"/>
+    <w:lsdException w:name="List Table 2 Accent 2" w:uiPriority="47"/>
+    <w:lsdException w:name="List Table 3 Accent 2" w:uiPriority="48"/>
+    <w:lsdException w:name="List Table 4 Accent 2" w:uiPriority="49"/>
+    <w:lsdException w:name="List Table 5 Dark Accent 2" w:uiPriority="50"/>
+    <w:lsdException w:name="List Table 6 Colorful Accent 2" w:uiPriority="51"/>
+    <w:lsdException w:name="List Table 7 Colorful Accent 2" w:uiPriority="52"/>
+    <w:lsdException w:name="List Table 1 Light Accent 3" w:uiPriority="46"/>
+    <w:lsdException w:name="List Table 2 Accent 3" w:uiPriority="47"/>
+    <w:lsdException w:name="List Table 3 Accent 3" w:uiPriority="48"/>
+    <w:lsdException w:name="List Table 4 Accent 3" w:uiPriority="49"/>
+    <w:lsdException w:name="List Table 5 Dark Accent 3" w:uiPriority="50"/>
+    <w:lsdException w:name="List Table 6 Colorful Accent 3" w:uiPriority="51"/>
+    <w:lsdException w:name="List Table 7 Colorful Accent 3" w:uiPriority="52"/>
+    <w:lsdException w:name="List Table 1 Light Accent 4" w:uiPriority="46"/>
+    <w:lsdException w:name="List Table 2 Accent 4" w:uiPriority="47"/>
+    <w:lsdException w:name="List Table 3 Accent 4" w:uiPriority="48"/>
+    <w:lsdException w:name="List Table 4 Accent 4" w:uiPriority="49"/>
+    <w:lsdException w:name="List Table 5 Dark Accent 4" w:uiPriority="50"/>
+    <w:lsdException w:name="List Table 6 Colorful Accent 4" w:uiPriority="51"/>
+    <w:lsdException w:name="List Table 7 Colorful Accent 4" w:uiPriority="52"/>
+    <w:lsdException w:name="List Table 1 Light Accent 5" w:uiPriority="46"/>
+    <w:lsdException w:name="List Table 2 Accent 5" w:uiPriority="47"/>
+    <w:lsdException w:name="List Table 3 Accent 5" w:uiPriority="48"/>
+    <w:lsdException w:name="List Table 4 Accent 5" w:uiPriority="49"/>
+    <w:lsdException w:name="List Table 5 Dark Accent 5" w:uiPriority="50"/>
+    <w:lsdException w:name="List Table 6 Colorful Accent 5" w:uiPriority="51"/>
+    <w:lsdException w:name="List Table 7 Colorful Accent 5" w:uiPriority="52"/>
+    <w:lsdException w:name="List Table 1 Light Accent 6" w:uiPriority="46"/>
+    <w:lsdException w:name="List Table 2 Accent 6" w:uiPriority="47"/>
+    <w:lsdException w:name="List Table 3 Accent 6" w:uiPriority="48"/>
+    <w:lsdException w:name="List Table 4 Accent 6" w:uiPriority="49"/>
+    <w:lsdException w:name="List Table 5 Dark Accent 6" w:uiPriority="50"/>
+    <w:lsdException w:name="List Table 6 Colorful Accent 6" w:uiPriority="51"/>
+    <w:lsdException w:name="List Table 7 Colorful Accent 6" w:uiPriority="52"/>
+    <w:lsdException w:name="Mention" w:semiHidden="1" w:uiPriority="99" w:unhideWhenUsed="1"/>
+    <w:lsdException w:name="Smart Hyperlink" w:semiHidden="1" w:uiPriority="99" w:unhideWhenUsed="1"/>
+    <w:lsdException w:name="Hashtag" w:semiHidden="1" w:uiPriority="99" w:unhideWhenUsed="1"/>
+    <w:lsdException w:name="Unresolved Mention" w:semiHidden="1" w:uiPriority="99" w:unhideWhenUsed="1"/>
+    <w:lsdException w:name="Smart Link" w:semiHidden="1" w:uiPriority="99" w:unhideWhenUsed="1"/>
+    <w:lsdException w:name="Smart Link Error" w:semiHidden="1" w:uiPriority="99" w:unhideWhenUsed="1"/>
   </w:latentStyles>
   <w:style w:type="paragraph" w:default="1" w:styleId="Normal">
     <w:name w:val="Normal"/>
@@ -10250,196 +10538,6 @@
 </w:styles>
 </file>
 
-<file path=word/stylesWithEffects.xml><?xml version="1.0" encoding="utf-8"?>
-<w:styles xmlns:wpc="http://schemas.microsoft.com/office/word/2010/wordprocessingCanvas" xmlns:mc="http://schemas.openxmlformats.org/markup-compatibility/2006" xmlns:o="urn:schemas-microsoft-com:office:office" xmlns:r="http://schemas.openxmlformats.org/officeDocument/2006/relationships" xmlns:m="http://schemas.openxmlformats.org/officeDocument/2006/math" xmlns:v="urn:schemas-microsoft-com:vml" xmlns:wp14="http://schemas.microsoft.com/office/word/2010/wordprocessingDrawing" xmlns:wp="http://schemas.openxmlformats.org/drawingml/2006/wordprocessingDrawing" xmlns:w10="urn:schemas-microsoft-com:office:word" xmlns:w="http://schemas.openxmlformats.org/wordprocessingml/2006/main" xmlns:w14="http://schemas.microsoft.com/office/word/2010/wordml" xmlns:wpg="http://schemas.microsoft.com/office/word/2010/wordprocessingGroup" xmlns:wpi="http://schemas.microsoft.com/office/word/2010/wordprocessingInk" xmlns:wne="http://schemas.microsoft.com/office/word/2006/wordml" xmlns:wps="http://schemas.microsoft.com/office/word/2010/wordprocessingShape" mc:Ignorable="w14 wp14">
-  <w:docDefaults>
-    <w:rPrDefault>
-      <w:rPr>
-        <w:rFonts w:asciiTheme="minorHAnsi" w:eastAsiaTheme="minorEastAsia" w:hAnsiTheme="minorHAnsi" w:cstheme="minorBidi"/>
-        <w:sz w:val="22"/>
-        <w:szCs w:val="22"/>
-        <w:lang w:val="en-US" w:eastAsia="en-US" w:bidi="ar-SA"/>
-      </w:rPr>
-    </w:rPrDefault>
-    <w:pPrDefault>
-      <w:pPr>
-        <w:spacing w:after="200" w:line="276" w:lineRule="auto"/>
-      </w:pPr>
-    </w:pPrDefault>
-  </w:docDefaults>
-  <w:latentStyles w:defLockedState="0" w:defUIPriority="99" w:defSemiHidden="1" w:defUnhideWhenUsed="1" w:defQFormat="0" w:count="267">
-    <w:lsdException w:name="Normal" w:semiHidden="0" w:uiPriority="0" w:unhideWhenUsed="0" w:qFormat="1"/>
-    <w:lsdException w:name="heading 1" w:semiHidden="0" w:uiPriority="9" w:unhideWhenUsed="0" w:qFormat="1"/>
-    <w:lsdException w:name="heading 2" w:uiPriority="9" w:qFormat="1"/>
-    <w:lsdException w:name="heading 3" w:uiPriority="9" w:qFormat="1"/>
-    <w:lsdException w:name="heading 4" w:uiPriority="9" w:qFormat="1"/>
-    <w:lsdException w:name="heading 5" w:uiPriority="9" w:qFormat="1"/>
-    <w:lsdException w:name="heading 6" w:uiPriority="9" w:qFormat="1"/>
-    <w:lsdException w:name="heading 7" w:uiPriority="9" w:qFormat="1"/>
-    <w:lsdException w:name="heading 8" w:uiPriority="9" w:qFormat="1"/>
-    <w:lsdException w:name="heading 9" w:uiPriority="9" w:qFormat="1"/>
-    <w:lsdException w:name="toc 1" w:uiPriority="39"/>
-    <w:lsdException w:name="toc 2" w:uiPriority="39"/>
-    <w:lsdException w:name="toc 3" w:uiPriority="39"/>
-    <w:lsdException w:name="toc 4" w:uiPriority="39"/>
-    <w:lsdException w:name="toc 5" w:uiPriority="39"/>
-    <w:lsdException w:name="toc 6" w:uiPriority="39"/>
-    <w:lsdException w:name="toc 7" w:uiPriority="39"/>
-    <w:lsdException w:name="toc 8" w:uiPriority="39"/>
-    <w:lsdException w:name="toc 9" w:uiPriority="39"/>
-    <w:lsdException w:name="caption" w:uiPriority="35" w:qFormat="1"/>
-    <w:lsdException w:name="Title" w:semiHidden="0" w:uiPriority="10" w:unhideWhenUsed="0" w:qFormat="1"/>
-    <w:lsdException w:name="Default Paragraph Font" w:uiPriority="1"/>
-    <w:lsdException w:name="Subtitle" w:semiHidden="0" w:uiPriority="11" w:unhideWhenUsed="0" w:qFormat="1"/>
-    <w:lsdException w:name="Strong" w:semiHidden="0" w:uiPriority="22" w:unhideWhenUsed="0" w:qFormat="1"/>
-    <w:lsdException w:name="Emphasis" w:semiHidden="0" w:uiPriority="20" w:unhideWhenUsed="0" w:qFormat="1"/>
-    <w:lsdException w:name="Table Grid" w:semiHidden="0" w:uiPriority="59" w:unhideWhenUsed="0"/>
-    <w:lsdException w:name="Placeholder Text" w:unhideWhenUsed="0"/>
-    <w:lsdException w:name="No Spacing" w:semiHidden="0" w:uiPriority="1" w:unhideWhenUsed="0" w:qFormat="1"/>
-    <w:lsdException w:name="Light Shading" w:semiHidden="0" w:uiPriority="60" w:unhideWhenUsed="0"/>
-    <w:lsdException w:name="Light List" w:semiHidden="0" w:uiPriority="61" w:unhideWhenUsed="0"/>
-    <w:lsdException w:name="Light Grid" w:semiHidden="0" w:uiPriority="62" w:unhideWhenUsed="0"/>
-    <w:lsdException w:name="Medium Shading 1" w:semiHidden="0" w:uiPriority="63" w:unhideWhenUsed="0"/>
-    <w:lsdException w:name="Medium Shading 2" w:semiHidden="0" w:uiPriority="64" w:unhideWhenUsed="0"/>
-    <w:lsdException w:name="Medium List 1" w:semiHidden="0" w:uiPriority="65" w:unhideWhenUsed="0"/>
-    <w:lsdException w:name="Medium List 2" w:semiHidden="0" w:uiPriority="66" w:unhideWhenUsed="0"/>
-    <w:lsdException w:name="Medium Grid 1" w:semiHidden="0" w:uiPriority="67" w:unhideWhenUsed="0"/>
-    <w:lsdException w:name="Medium Grid 2" w:semiHidden="0" w:uiPriority="68" w:unhideWhenUsed="0"/>
-    <w:lsdException w:name="Medium Grid 3" w:semiHidden="0" w:uiPriority="69" w:unhideWhenUsed="0"/>
-    <w:lsdException w:name="Dark List" w:semiHidden="0" w:uiPriority="70" w:unhideWhenUsed="0"/>
-    <w:lsdException w:name="Colorful Shading" w:semiHidden="0" w:uiPriority="71" w:unhideWhenUsed="0"/>
-    <w:lsdException w:name="Colorful List" w:semiHidden="0" w:uiPriority="72" w:unhideWhenUsed="0"/>
-    <w:lsdException w:name="Colorful Grid" w:semiHidden="0" w:uiPriority="73" w:unhideWhenUsed="0"/>
-    <w:lsdException w:name="Light Shading Accent 1" w:semiHidden="0" w:uiPriority="60" w:unhideWhenUsed="0"/>
-    <w:lsdException w:name="Light List Accent 1" w:semiHidden="0" w:uiPriority="61" w:unhideWhenUsed="0"/>
-    <w:lsdException w:name="Light Grid Accent 1" w:semiHidden="0" w:uiPriority="62" w:unhideWhenUsed="0"/>
-    <w:lsdException w:name="Medium Shading 1 Accent 1" w:semiHidden="0" w:uiPriority="63" w:unhideWhenUsed="0"/>
-    <w:lsdException w:name="Medium Shading 2 Accent 1" w:semiHidden="0" w:uiPriority="64" w:unhideWhenUsed="0"/>
-    <w:lsdException w:name="Medium List 1 Accent 1" w:semiHidden="0" w:uiPriority="65" w:unhideWhenUsed="0"/>
-    <w:lsdException w:name="Revision" w:unhideWhenUsed="0"/>
-    <w:lsdException w:name="List Paragraph" w:semiHidden="0" w:uiPriority="34" w:unhideWhenUsed="0" w:qFormat="1"/>
-    <w:lsdException w:name="Quote" w:semiHidden="0" w:uiPriority="29" w:unhideWhenUsed="0" w:qFormat="1"/>
-    <w:lsdException w:name="Intense Quote" w:semiHidden="0" w:uiPriority="30" w:unhideWhenUsed="0" w:qFormat="1"/>
-    <w:lsdException w:name="Medium List 2 Accent 1" w:semiHidden="0" w:uiPriority="66" w:unhideWhenUsed="0"/>
-    <w:lsdException w:name="Medium Grid 1 Accent 1" w:semiHidden="0" w:uiPriority="67" w:unhideWhenUsed="0"/>
-    <w:lsdException w:name="Medium Grid 2 Accent 1" w:semiHidden="0" w:uiPriority="68" w:unhideWhenUsed="0"/>
-    <w:lsdException w:name="Medium Grid 3 Accent 1" w:semiHidden="0" w:uiPriority="69" w:unhideWhenUsed="0"/>
-    <w:lsdException w:name="Dark List Accent 1" w:semiHidden="0" w:uiPriority="70" w:unhideWhenUsed="0"/>
-    <w:lsdException w:name="Colorful Shading Accent 1" w:semiHidden="0" w:uiPriority="71" w:unhideWhenUsed="0"/>
-    <w:lsdException w:name="Colorful List Accent 1" w:semiHidden="0" w:uiPriority="72" w:unhideWhenUsed="0"/>
-    <w:lsdException w:name="Colorful Grid Accent 1" w:semiHidden="0" w:uiPriority="73" w:unhideWhenUsed="0"/>
-    <w:lsdException w:name="Light Shading Accent 2" w:semiHidden="0" w:uiPriority="60" w:unhideWhenUsed="0"/>
-    <w:lsdException w:name="Light List Accent 2" w:semiHidden="0" w:uiPriority="61" w:unhideWhenUsed="0"/>
-    <w:lsdException w:name="Light Grid Accent 2" w:semiHidden="0" w:uiPriority="62" w:unhideWhenUsed="0"/>
-    <w:lsdException w:name="Medium Shading 1 Accent 2" w:semiHidden="0" w:uiPriority="63" w:unhideWhenUsed="0"/>
-    <w:lsdException w:name="Medium Shading 2 Accent 2" w:semiHidden="0" w:uiPriority="64" w:unhideWhenUsed="0"/>
-    <w:lsdException w:name="Medium List 1 Accent 2" w:semiHidden="0" w:uiPriority="65" w:unhideWhenUsed="0"/>
-    <w:lsdException w:name="Medium List 2 Accent 2" w:semiHidden="0" w:uiPriority="66" w:unhideWhenUsed="0"/>
-    <w:lsdException w:name="Medium Grid 1 Accent 2" w:semiHidden="0" w:uiPriority="67" w:unhideWhenUsed="0"/>
-    <w:lsdException w:name="Medium Grid 2 Accent 2" w:semiHidden="0" w:uiPriority="68" w:unhideWhenUsed="0"/>
-    <w:lsdException w:name="Medium Grid 3 Accent 2" w:semiHidden="0" w:uiPriority="69" w:unhideWhenUsed="0"/>
-    <w:lsdException w:name="Dark List Accent 2" w:semiHidden="0" w:uiPriority="70" w:unhideWhenUsed="0"/>
-    <w:lsdException w:name="Colorful Shading Accent 2" w:semiHidden="0" w:uiPriority="71" w:unhideWhenUsed="0"/>
-    <w:lsdException w:name="Colorful List Accent 2" w:semiHidden="0" w:uiPriority="72" w:unhideWhenUsed="0"/>
-    <w:lsdException w:name="Colorful Grid Accent 2" w:semiHidden="0" w:uiPriority="73" w:unhideWhenUsed="0"/>
-    <w:lsdException w:name="Light Shading Accent 3" w:semiHidden="0" w:uiPriority="60" w:unhideWhenUsed="0"/>
-    <w:lsdException w:name="Light List Accent 3" w:semiHidden="0" w:uiPriority="61" w:unhideWhenUsed="0"/>
-    <w:lsdException w:name="Light Grid Accent 3" w:semiHidden="0" w:uiPriority="62" w:unhideWhenUsed="0"/>
-    <w:lsdException w:name="Medium Shading 1 Accent 3" w:semiHidden="0" w:uiPriority="63" w:unhideWhenUsed="0"/>
-    <w:lsdException w:name="Medium Shading 2 Accent 3" w:semiHidden="0" w:uiPriority="64" w:unhideWhenUsed="0"/>
-    <w:lsdException w:name="Medium List 1 Accent 3" w:semiHidden="0" w:uiPriority="65" w:unhideWhenUsed="0"/>
-    <w:lsdException w:name="Medium List 2 Accent 3" w:semiHidden="0" w:uiPriority="66" w:unhideWhenUsed="0"/>
-    <w:lsdException w:name="Medium Grid 1 Accent 3" w:semiHidden="0" w:uiPriority="67" w:unhideWhenUsed="0"/>
-    <w:lsdException w:name="Medium Grid 2 Accent 3" w:semiHidden="0" w:uiPriority="68" w:unhideWhenUsed="0"/>
-    <w:lsdException w:name="Medium Grid 3 Accent 3" w:semiHidden="0" w:uiPriority="69" w:unhideWhenUsed="0"/>
-    <w:lsdException w:name="Dark List Accent 3" w:semiHidden="0" w:uiPriority="70" w:unhideWhenUsed="0"/>
-    <w:lsdException w:name="Colorful Shading Accent 3" w:semiHidden="0" w:uiPriority="71" w:unhideWhenUsed="0"/>
-    <w:lsdException w:name="Colorful List Accent 3" w:semiHidden="0" w:uiPriority="72" w:unhideWhenUsed="0"/>
-    <w:lsdException w:name="Colorful Grid Accent 3" w:semiHidden="0" w:uiPriority="73" w:unhideWhenUsed="0"/>
-    <w:lsdException w:name="Light Shading Accent 4" w:semiHidden="0" w:uiPriority="60" w:unhideWhenUsed="0"/>
-    <w:lsdException w:name="Light List Accent 4" w:semiHidden="0" w:uiPriority="61" w:unhideWhenUsed="0"/>
-    <w:lsdException w:name="Light Grid Accent 4" w:semiHidden="0" w:uiPriority="62" w:unhideWhenUsed="0"/>
-    <w:lsdException w:name="Medium Shading 1 Accent 4" w:semiHidden="0" w:uiPriority="63" w:unhideWhenUsed="0"/>
-    <w:lsdException w:name="Medium Shading 2 Accent 4" w:semiHidden="0" w:uiPriority="64" w:unhideWhenUsed="0"/>
-    <w:lsdException w:name="Medium List 1 Accent 4" w:semiHidden="0" w:uiPriority="65" w:unhideWhenUsed="0"/>
-    <w:lsdException w:name="Medium List 2 Accent 4" w:semiHidden="0" w:uiPriority="66" w:unhideWhenUsed="0"/>
-    <w:lsdException w:name="Medium Grid 1 Accent 4" w:semiHidden="0" w:uiPriority="67" w:unhideWhenUsed="0"/>
-    <w:lsdException w:name="Medium Grid 2 Accent 4" w:semiHidden="0" w:uiPriority="68" w:unhideWhenUsed="0"/>
-    <w:lsdException w:name="Medium Grid 3 Accent 4" w:semiHidden="0" w:uiPriority="69" w:unhideWhenUsed="0"/>
-    <w:lsdException w:name="Dark List Accent 4" w:semiHidden="0" w:uiPriority="70" w:unhideWhenUsed="0"/>
-    <w:lsdException w:name="Colorful Shading Accent 4" w:semiHidden="0" w:uiPriority="71" w:unhideWhenUsed="0"/>
-    <w:lsdException w:name="Colorful List Accent 4" w:semiHidden="0" w:uiPriority="72" w:unhideWhenUsed="0"/>
-    <w:lsdException w:name="Colorful Grid Accent 4" w:semiHidden="0" w:uiPriority="73" w:unhideWhenUsed="0"/>
-    <w:lsdException w:name="Light Shading Accent 5" w:semiHidden="0" w:uiPriority="60" w:unhideWhenUsed="0"/>
-    <w:lsdException w:name="Light List Accent 5" w:semiHidden="0" w:uiPriority="61" w:unhideWhenUsed="0"/>
-    <w:lsdException w:name="Light Grid Accent 5" w:semiHidden="0" w:uiPriority="62" w:unhideWhenUsed="0"/>
-    <w:lsdException w:name="Medium Shading 1 Accent 5" w:semiHidden="0" w:uiPriority="63" w:unhideWhenUsed="0"/>
-    <w:lsdException w:name="Medium Shading 2 Accent 5" w:semiHidden="0" w:uiPriority="64" w:unhideWhenUsed="0"/>
-    <w:lsdException w:name="Medium List 1 Accent 5" w:semiHidden="0" w:uiPriority="65" w:unhideWhenUsed="0"/>
-    <w:lsdException w:name="Medium List 2 Accent 5" w:semiHidden="0" w:uiPriority="66" w:unhideWhenUsed="0"/>
-    <w:lsdException w:name="Medium Grid 1 Accent 5" w:semiHidden="0" w:uiPriority="67" w:unhideWhenUsed="0"/>
-    <w:lsdException w:name="Medium Grid 2 Accent 5" w:semiHidden="0" w:uiPriority="68" w:unhideWhenUsed="0"/>
-    <w:lsdException w:name="Medium Grid 3 Accent 5" w:semiHidden="0" w:uiPriority="69" w:unhideWhenUsed="0"/>
-    <w:lsdException w:name="Dark List Accent 5" w:semiHidden="0" w:uiPriority="70" w:unhideWhenUsed="0"/>
-    <w:lsdException w:name="Colorful Shading Accent 5" w:semiHidden="0" w:uiPriority="71" w:unhideWhenUsed="0"/>
-    <w:lsdException w:name="Colorful List Accent 5" w:semiHidden="0" w:uiPriority="72" w:unhideWhenUsed="0"/>
-    <w:lsdException w:name="Colorful Grid Accent 5" w:semiHidden="0" w:uiPriority="73" w:unhideWhenUsed="0"/>
-    <w:lsdException w:name="Light Shading Accent 6" w:semiHidden="0" w:uiPriority="60" w:unhideWhenUsed="0"/>
-    <w:lsdException w:name="Light List Accent 6" w:semiHidden="0" w:uiPriority="61" w:unhideWhenUsed="0"/>
-    <w:lsdException w:name="Light Grid Accent 6" w:semiHidden="0" w:uiPriority="62" w:unhideWhenUsed="0"/>
-    <w:lsdException w:name="Medium Shading 1 Accent 6" w:semiHidden="0" w:uiPriority="63" w:unhideWhenUsed="0"/>
-    <w:lsdException w:name="Medium Shading 2 Accent 6" w:semiHidden="0" w:uiPriority="64" w:unhideWhenUsed="0"/>
-    <w:lsdException w:name="Medium List 1 Accent 6" w:semiHidden="0" w:uiPriority="65" w:unhideWhenUsed="0"/>
-    <w:lsdException w:name="Medium List 2 Accent 6" w:semiHidden="0" w:uiPriority="66" w:unhideWhenUsed="0"/>
-    <w:lsdException w:name="Medium Grid 1 Accent 6" w:semiHidden="0" w:uiPriority="67" w:unhideWhenUsed="0"/>
-    <w:lsdException w:name="Medium Grid 2 Accent 6" w:semiHidden="0" w:uiPriority="68" w:unhideWhenUsed="0"/>
-    <w:lsdException w:name="Medium Grid 3 Accent 6" w:semiHidden="0" w:uiPriority="69" w:unhideWhenUsed="0"/>
-    <w:lsdException w:name="Dark List Accent 6" w:semiHidden="0" w:uiPriority="70" w:unhideWhenUsed="0"/>
-    <w:lsdException w:name="Colorful Shading Accent 6" w:semiHidden="0" w:uiPriority="71" w:unhideWhenUsed="0"/>
-    <w:lsdException w:name="Colorful List Accent 6" w:semiHidden="0" w:uiPriority="72" w:unhideWhenUsed="0"/>
-    <w:lsdException w:name="Colorful Grid Accent 6" w:semiHidden="0" w:uiPriority="73" w:unhideWhenUsed="0"/>
-    <w:lsdException w:name="Subtle Emphasis" w:semiHidden="0" w:uiPriority="19" w:unhideWhenUsed="0" w:qFormat="1"/>
-    <w:lsdException w:name="Intense Emphasis" w:semiHidden="0" w:uiPriority="21" w:unhideWhenUsed="0" w:qFormat="1"/>
-    <w:lsdException w:name="Subtle Reference" w:semiHidden="0" w:uiPriority="31" w:unhideWhenUsed="0" w:qFormat="1"/>
-    <w:lsdException w:name="Intense Reference" w:semiHidden="0" w:uiPriority="32" w:unhideWhenUsed="0" w:qFormat="1"/>
-    <w:lsdException w:name="Book Title" w:semiHidden="0" w:uiPriority="33" w:unhideWhenUsed="0" w:qFormat="1"/>
-    <w:lsdException w:name="Bibliography" w:uiPriority="37"/>
-    <w:lsdException w:name="TOC Heading" w:uiPriority="39" w:qFormat="1"/>
-  </w:latentStyles>
-  <w:style w:type="paragraph" w:default="1" w:styleId="Normal">
-    <w:name w:val="Normal"/>
-    <w:qFormat/>
-  </w:style>
-  <w:style w:type="character" w:default="1" w:styleId="DefaultParagraphFont">
-    <w:name w:val="Default Paragraph Font"/>
-    <w:uiPriority w:val="1"/>
-    <w:semiHidden/>
-    <w:unhideWhenUsed/>
-  </w:style>
-  <w:style w:type="table" w:default="1" w:styleId="TableNormal">
-    <w:name w:val="Normal Table"/>
-    <w:uiPriority w:val="99"/>
-    <w:semiHidden/>
-    <w:unhideWhenUsed/>
-    <w:tblPr>
-      <w:tblInd w:w="0" w:type="dxa"/>
-      <w:tblCellMar>
-        <w:top w:w="0" w:type="dxa"/>
-        <w:left w:w="108" w:type="dxa"/>
-        <w:bottom w:w="0" w:type="dxa"/>
-        <w:right w:w="108" w:type="dxa"/>
-      </w:tblCellMar>
-    </w:tblPr>
-  </w:style>
-  <w:style w:type="numbering" w:default="1" w:styleId="NoList">
-    <w:name w:val="No List"/>
-    <w:uiPriority w:val="99"/>
-    <w:semiHidden/>
-    <w:unhideWhenUsed/>
-  </w:style>
-</w:styles>
-</file>
-
 <file path=word/theme/theme1.xml><?xml version="1.0" encoding="utf-8"?>
 <a:theme xmlns:a="http://schemas.openxmlformats.org/drawingml/2006/main" name="Office Theme">
   <a:themeElements>

</xml_diff>